<commit_message>
Initial commit. Still not completed yet. Includes a few feedback items.
</commit_message>
<xml_diff>
--- a/Biannual/CCDM Biannaul Instructions.docx
+++ b/Biannual/CCDM Biannaul Instructions.docx
@@ -43,17 +43,6 @@
     </w:p>
     <w:p>
       <w:pPr>
-        <w:spacing w:after="0" w:line="240" w:lineRule="auto"/>
-        <w:rPr>
-          <w:rFonts w:ascii="Times New Roman" w:eastAsia="Times New Roman" w:hAnsi="Times New Roman" w:cs="Times New Roman"/>
-          <w:b/>
-          <w:sz w:val="20"/>
-          <w:szCs w:val="24"/>
-        </w:rPr>
-      </w:pPr>
-    </w:p>
-    <w:p>
-      <w:pPr>
         <w:pStyle w:val="ListParagraph"/>
         <w:numPr>
           <w:ilvl w:val="0"/>
@@ -77,7 +66,7 @@
           <w:sz w:val="20"/>
           <w:szCs w:val="24"/>
         </w:rPr>
-        <w:t>Generate a directory in Noodle to store files for this biannual</w:t>
+        <w:t>Kick off the ccdm_biannual.py script</w:t>
       </w:r>
     </w:p>
     <w:p>
@@ -102,7 +91,92 @@
           <w:sz w:val="20"/>
           <w:szCs w:val="24"/>
         </w:rPr>
-        <w:t xml:space="preserve">In directory </w:t>
+        <w:t xml:space="preserve">Either SSH or using </w:t>
+      </w:r>
+      <w:proofErr w:type="spellStart"/>
+      <w:r>
+        <w:rPr>
+          <w:rFonts w:ascii="Times New Roman" w:eastAsia="Times New Roman" w:hAnsi="Times New Roman" w:cs="Times New Roman"/>
+          <w:bCs/>
+          <w:sz w:val="20"/>
+          <w:szCs w:val="24"/>
+        </w:rPr>
+        <w:t>mobaxterm</w:t>
+      </w:r>
+      <w:proofErr w:type="spellEnd"/>
+      <w:r>
+        <w:rPr>
+          <w:rFonts w:ascii="Times New Roman" w:eastAsia="Times New Roman" w:hAnsi="Times New Roman" w:cs="Times New Roman"/>
+          <w:bCs/>
+          <w:sz w:val="20"/>
+          <w:szCs w:val="24"/>
+        </w:rPr>
+        <w:t xml:space="preserve"> into </w:t>
+      </w:r>
+      <w:proofErr w:type="spellStart"/>
+      <w:r>
+        <w:rPr>
+          <w:rFonts w:ascii="Times New Roman" w:eastAsia="Times New Roman" w:hAnsi="Times New Roman" w:cs="Times New Roman"/>
+          <w:bCs/>
+          <w:sz w:val="20"/>
+          <w:szCs w:val="24"/>
+        </w:rPr>
+        <w:t>chimchim</w:t>
+      </w:r>
+      <w:proofErr w:type="spellEnd"/>
+      <w:r>
+        <w:rPr>
+          <w:rFonts w:ascii="Times New Roman" w:eastAsia="Times New Roman" w:hAnsi="Times New Roman" w:cs="Times New Roman"/>
+          <w:bCs/>
+          <w:sz w:val="20"/>
+          <w:szCs w:val="24"/>
+        </w:rPr>
+        <w:t xml:space="preserve"> (131.142.113.13)</w:t>
+      </w:r>
+    </w:p>
+    <w:p>
+      <w:pPr>
+        <w:pStyle w:val="ListParagraph"/>
+        <w:numPr>
+          <w:ilvl w:val="2"/>
+          <w:numId w:val="3"/>
+        </w:numPr>
+        <w:spacing w:after="0" w:line="240" w:lineRule="auto"/>
+        <w:rPr>
+          <w:rFonts w:ascii="Times New Roman" w:eastAsia="Times New Roman" w:hAnsi="Times New Roman" w:cs="Times New Roman"/>
+          <w:bCs/>
+          <w:sz w:val="20"/>
+          <w:szCs w:val="24"/>
+        </w:rPr>
+      </w:pPr>
+      <w:r>
+        <w:rPr>
+          <w:rFonts w:ascii="Times New Roman" w:eastAsia="Times New Roman" w:hAnsi="Times New Roman" w:cs="Times New Roman"/>
+          <w:bCs/>
+          <w:sz w:val="20"/>
+          <w:szCs w:val="24"/>
+        </w:rPr>
+        <w:t>“</w:t>
+      </w:r>
+      <w:proofErr w:type="spellStart"/>
+      <w:r>
+        <w:rPr>
+          <w:rFonts w:ascii="Times New Roman" w:eastAsia="Times New Roman" w:hAnsi="Times New Roman" w:cs="Times New Roman"/>
+          <w:bCs/>
+          <w:sz w:val="20"/>
+          <w:szCs w:val="24"/>
+        </w:rPr>
+        <w:t>ssh</w:t>
+      </w:r>
+      <w:proofErr w:type="spellEnd"/>
+      <w:r>
+        <w:rPr>
+          <w:rFonts w:ascii="Times New Roman" w:eastAsia="Times New Roman" w:hAnsi="Times New Roman" w:cs="Times New Roman"/>
+          <w:bCs/>
+          <w:sz w:val="20"/>
+          <w:szCs w:val="24"/>
+        </w:rPr>
+        <w:t xml:space="preserve"> </w:t>
       </w:r>
       <w:hyperlink r:id="rId7" w:history="1">
         <w:r>
@@ -113,7 +187,7 @@
             <w:sz w:val="20"/>
             <w:szCs w:val="24"/>
           </w:rPr>
-          <w:t>\\Noodle\fot\engineering\ccdm\Current_CCDM_Files\Quarterly Report\</w:t>
+          <w:t>username@131.142.113.13</w:t>
         </w:r>
       </w:hyperlink>
       <w:r>
@@ -123,7 +197,7 @@
           <w:sz w:val="20"/>
           <w:szCs w:val="24"/>
         </w:rPr>
-        <w:t xml:space="preserve"> create a new directory with the format of “NM_YYMMM_YYMMM” where NM is the number of biannual, YYMMM is the year and month of the biannual range.</w:t>
+        <w:t>”, input password when prompted</w:t>
       </w:r>
     </w:p>
     <w:p>
@@ -148,7 +222,137 @@
           <w:sz w:val="20"/>
           <w:szCs w:val="24"/>
         </w:rPr>
-        <w:t>Inside newly created directory, create a directory called “Files”</w:t>
+        <w:t>“cd” into the following directory</w:t>
+      </w:r>
+      <w:r>
+        <w:rPr>
+          <w:rFonts w:ascii="Times New Roman" w:eastAsia="Times New Roman" w:hAnsi="Times New Roman" w:cs="Times New Roman"/>
+          <w:bCs/>
+          <w:sz w:val="20"/>
+          <w:szCs w:val="24"/>
+        </w:rPr>
+        <w:t xml:space="preserve"> in </w:t>
+      </w:r>
+      <w:proofErr w:type="spellStart"/>
+      <w:r>
+        <w:rPr>
+          <w:rFonts w:ascii="Times New Roman" w:eastAsia="Times New Roman" w:hAnsi="Times New Roman" w:cs="Times New Roman"/>
+          <w:bCs/>
+          <w:sz w:val="20"/>
+          <w:szCs w:val="24"/>
+        </w:rPr>
+        <w:t>chimchim</w:t>
+      </w:r>
+      <w:proofErr w:type="spellEnd"/>
+      <w:r>
+        <w:rPr>
+          <w:rFonts w:ascii="Times New Roman" w:eastAsia="Times New Roman" w:hAnsi="Times New Roman" w:cs="Times New Roman"/>
+          <w:bCs/>
+          <w:sz w:val="20"/>
+          <w:szCs w:val="24"/>
+        </w:rPr>
+        <w:t xml:space="preserve"> session</w:t>
+      </w:r>
+      <w:r>
+        <w:rPr>
+          <w:rFonts w:ascii="Times New Roman" w:eastAsia="Times New Roman" w:hAnsi="Times New Roman" w:cs="Times New Roman"/>
+          <w:bCs/>
+          <w:sz w:val="20"/>
+          <w:szCs w:val="24"/>
+        </w:rPr>
+        <w:t>:</w:t>
+      </w:r>
+    </w:p>
+    <w:p>
+      <w:pPr>
+        <w:pStyle w:val="ListParagraph"/>
+        <w:numPr>
+          <w:ilvl w:val="2"/>
+          <w:numId w:val="3"/>
+        </w:numPr>
+        <w:spacing w:after="0" w:line="240" w:lineRule="auto"/>
+        <w:rPr>
+          <w:rFonts w:ascii="Times New Roman" w:eastAsia="Times New Roman" w:hAnsi="Times New Roman" w:cs="Times New Roman"/>
+          <w:b/>
+          <w:sz w:val="20"/>
+          <w:szCs w:val="24"/>
+        </w:rPr>
+      </w:pPr>
+      <w:r>
+        <w:rPr>
+          <w:rFonts w:ascii="Times New Roman" w:eastAsia="Times New Roman" w:hAnsi="Times New Roman" w:cs="Times New Roman"/>
+          <w:b/>
+          <w:sz w:val="20"/>
+          <w:szCs w:val="24"/>
+        </w:rPr>
+        <w:t>“cd /home/</w:t>
+      </w:r>
+      <w:proofErr w:type="spellStart"/>
+      <w:r>
+        <w:rPr>
+          <w:rFonts w:ascii="Times New Roman" w:eastAsia="Times New Roman" w:hAnsi="Times New Roman" w:cs="Times New Roman"/>
+          <w:b/>
+          <w:sz w:val="20"/>
+          <w:szCs w:val="24"/>
+        </w:rPr>
+        <w:t>rhoover</w:t>
+      </w:r>
+      <w:proofErr w:type="spellEnd"/>
+      <w:r>
+        <w:rPr>
+          <w:rFonts w:ascii="Times New Roman" w:eastAsia="Times New Roman" w:hAnsi="Times New Roman" w:cs="Times New Roman"/>
+          <w:b/>
+          <w:sz w:val="20"/>
+          <w:szCs w:val="24"/>
+        </w:rPr>
+        <w:t>/</w:t>
+      </w:r>
+      <w:r>
+        <w:rPr>
+          <w:rFonts w:ascii="Times New Roman" w:eastAsia="Times New Roman" w:hAnsi="Times New Roman" w:cs="Times New Roman"/>
+          <w:b/>
+          <w:sz w:val="20"/>
+          <w:szCs w:val="24"/>
+        </w:rPr>
+        <w:t>python/</w:t>
+      </w:r>
+      <w:r>
+        <w:rPr>
+          <w:rFonts w:ascii="Times New Roman" w:eastAsia="Times New Roman" w:hAnsi="Times New Roman" w:cs="Times New Roman"/>
+          <w:b/>
+          <w:sz w:val="20"/>
+          <w:szCs w:val="24"/>
+        </w:rPr>
+        <w:t>Code/</w:t>
+      </w:r>
+      <w:proofErr w:type="spellStart"/>
+      <w:r>
+        <w:rPr>
+          <w:rFonts w:ascii="Times New Roman" w:eastAsia="Times New Roman" w:hAnsi="Times New Roman" w:cs="Times New Roman"/>
+          <w:b/>
+          <w:sz w:val="20"/>
+          <w:szCs w:val="24"/>
+        </w:rPr>
+        <w:t>ccdm</w:t>
+      </w:r>
+      <w:proofErr w:type="spellEnd"/>
+      <w:r>
+        <w:rPr>
+          <w:rFonts w:ascii="Times New Roman" w:eastAsia="Times New Roman" w:hAnsi="Times New Roman" w:cs="Times New Roman"/>
+          <w:b/>
+          <w:sz w:val="20"/>
+          <w:szCs w:val="24"/>
+        </w:rPr>
+        <w:t>/Biannual/”</w:t>
+      </w:r>
+      <w:r>
+        <w:rPr>
+          <w:rFonts w:ascii="Times New Roman" w:eastAsia="Times New Roman" w:hAnsi="Times New Roman" w:cs="Times New Roman"/>
+          <w:bCs/>
+          <w:sz w:val="20"/>
+          <w:szCs w:val="24"/>
+        </w:rPr>
+        <w:t>, in console window</w:t>
       </w:r>
     </w:p>
     <w:p>
@@ -173,19 +377,239 @@
           <w:sz w:val="20"/>
           <w:szCs w:val="24"/>
         </w:rPr>
-        <w:t>Inside newly created “Files” directory, create a directory called “SSR”. These will store files that are read by the “CCDM Biannual.py” script.</w:t>
-      </w:r>
-    </w:p>
-    <w:p>
-      <w:pPr>
-        <w:spacing w:after="0" w:line="240" w:lineRule="auto"/>
-        <w:rPr>
-          <w:rFonts w:ascii="Times New Roman" w:eastAsia="Times New Roman" w:hAnsi="Times New Roman" w:cs="Times New Roman"/>
-          <w:b/>
-          <w:sz w:val="20"/>
-          <w:szCs w:val="24"/>
-        </w:rPr>
-      </w:pPr>
+        <w:t xml:space="preserve">Activate the </w:t>
+      </w:r>
+      <w:r>
+        <w:rPr>
+          <w:rFonts w:ascii="Times New Roman" w:eastAsia="Times New Roman" w:hAnsi="Times New Roman" w:cs="Times New Roman"/>
+          <w:b/>
+          <w:sz w:val="20"/>
+          <w:szCs w:val="24"/>
+        </w:rPr>
+        <w:t>“ska3flight”</w:t>
+      </w:r>
+      <w:r>
+        <w:rPr>
+          <w:rFonts w:ascii="Times New Roman" w:eastAsia="Times New Roman" w:hAnsi="Times New Roman" w:cs="Times New Roman"/>
+          <w:bCs/>
+          <w:sz w:val="20"/>
+          <w:szCs w:val="24"/>
+        </w:rPr>
+        <w:t xml:space="preserve"> environment</w:t>
+      </w:r>
+    </w:p>
+    <w:p>
+      <w:pPr>
+        <w:pStyle w:val="ListParagraph"/>
+        <w:numPr>
+          <w:ilvl w:val="2"/>
+          <w:numId w:val="3"/>
+        </w:numPr>
+        <w:spacing w:after="0" w:line="240" w:lineRule="auto"/>
+        <w:rPr>
+          <w:rFonts w:ascii="Times New Roman" w:eastAsia="Times New Roman" w:hAnsi="Times New Roman" w:cs="Times New Roman"/>
+          <w:bCs/>
+          <w:sz w:val="20"/>
+          <w:szCs w:val="24"/>
+        </w:rPr>
+      </w:pPr>
+      <w:r>
+        <w:rPr>
+          <w:rFonts w:ascii="Times New Roman" w:eastAsia="Times New Roman" w:hAnsi="Times New Roman" w:cs="Times New Roman"/>
+          <w:b/>
+          <w:sz w:val="20"/>
+          <w:szCs w:val="24"/>
+        </w:rPr>
+        <w:t>“ska3flight”</w:t>
+      </w:r>
+      <w:r>
+        <w:rPr>
+          <w:rFonts w:ascii="Times New Roman" w:eastAsia="Times New Roman" w:hAnsi="Times New Roman" w:cs="Times New Roman"/>
+          <w:bCs/>
+          <w:sz w:val="20"/>
+          <w:szCs w:val="24"/>
+        </w:rPr>
+        <w:t>, in console window</w:t>
+      </w:r>
+    </w:p>
+    <w:p>
+      <w:pPr>
+        <w:pStyle w:val="ListParagraph"/>
+        <w:numPr>
+          <w:ilvl w:val="1"/>
+          <w:numId w:val="3"/>
+        </w:numPr>
+        <w:spacing w:after="0" w:line="240" w:lineRule="auto"/>
+        <w:rPr>
+          <w:rFonts w:ascii="Times New Roman" w:eastAsia="Times New Roman" w:hAnsi="Times New Roman" w:cs="Times New Roman"/>
+          <w:bCs/>
+          <w:sz w:val="20"/>
+          <w:szCs w:val="24"/>
+        </w:rPr>
+      </w:pPr>
+      <w:r>
+        <w:rPr>
+          <w:rFonts w:ascii="Times New Roman" w:eastAsia="Times New Roman" w:hAnsi="Times New Roman" w:cs="Times New Roman"/>
+          <w:bCs/>
+          <w:sz w:val="20"/>
+          <w:szCs w:val="24"/>
+        </w:rPr>
+        <w:t>Run the CCDM Biannual Report python script with the following command</w:t>
+      </w:r>
+    </w:p>
+    <w:p>
+      <w:pPr>
+        <w:pStyle w:val="ListParagraph"/>
+        <w:numPr>
+          <w:ilvl w:val="2"/>
+          <w:numId w:val="3"/>
+        </w:numPr>
+        <w:spacing w:after="0" w:line="240" w:lineRule="auto"/>
+        <w:rPr>
+          <w:rFonts w:ascii="Times New Roman" w:eastAsia="Times New Roman" w:hAnsi="Times New Roman" w:cs="Times New Roman"/>
+          <w:b/>
+          <w:sz w:val="20"/>
+          <w:szCs w:val="24"/>
+        </w:rPr>
+      </w:pPr>
+      <w:r>
+        <w:rPr>
+          <w:rFonts w:ascii="Times New Roman" w:eastAsia="Times New Roman" w:hAnsi="Times New Roman" w:cs="Times New Roman"/>
+          <w:b/>
+          <w:sz w:val="20"/>
+          <w:szCs w:val="24"/>
+        </w:rPr>
+        <w:t>“</w:t>
+      </w:r>
+      <w:r>
+        <w:rPr>
+          <w:rFonts w:ascii="Times New Roman" w:eastAsia="Times New Roman" w:hAnsi="Times New Roman" w:cs="Times New Roman"/>
+          <w:b/>
+          <w:sz w:val="20"/>
+          <w:szCs w:val="24"/>
+        </w:rPr>
+        <w:t xml:space="preserve">python </w:t>
+      </w:r>
+      <w:r>
+        <w:rPr>
+          <w:rFonts w:ascii="Times New Roman" w:eastAsia="Times New Roman" w:hAnsi="Times New Roman" w:cs="Times New Roman"/>
+          <w:b/>
+          <w:sz w:val="20"/>
+          <w:szCs w:val="24"/>
+        </w:rPr>
+        <w:t>ccdm_biannual</w:t>
+      </w:r>
+      <w:r>
+        <w:rPr>
+          <w:rFonts w:ascii="Times New Roman" w:eastAsia="Times New Roman" w:hAnsi="Times New Roman" w:cs="Times New Roman"/>
+          <w:b/>
+          <w:sz w:val="20"/>
+          <w:szCs w:val="24"/>
+        </w:rPr>
+        <w:t>.py</w:t>
+      </w:r>
+      <w:r>
+        <w:rPr>
+          <w:rFonts w:ascii="Times New Roman" w:eastAsia="Times New Roman" w:hAnsi="Times New Roman" w:cs="Times New Roman"/>
+          <w:b/>
+          <w:sz w:val="20"/>
+          <w:szCs w:val="24"/>
+        </w:rPr>
+        <w:t>”</w:t>
+      </w:r>
+      <w:r>
+        <w:rPr>
+          <w:rFonts w:ascii="Times New Roman" w:eastAsia="Times New Roman" w:hAnsi="Times New Roman" w:cs="Times New Roman"/>
+          <w:bCs/>
+          <w:sz w:val="20"/>
+          <w:szCs w:val="24"/>
+        </w:rPr>
+        <w:t>, in console window</w:t>
+      </w:r>
+    </w:p>
+    <w:p>
+      <w:pPr>
+        <w:pStyle w:val="ListParagraph"/>
+        <w:numPr>
+          <w:ilvl w:val="1"/>
+          <w:numId w:val="3"/>
+        </w:numPr>
+        <w:spacing w:after="0" w:line="240" w:lineRule="auto"/>
+        <w:rPr>
+          <w:rFonts w:ascii="Times New Roman" w:eastAsia="Times New Roman" w:hAnsi="Times New Roman" w:cs="Times New Roman"/>
+          <w:bCs/>
+          <w:sz w:val="20"/>
+          <w:szCs w:val="24"/>
+        </w:rPr>
+      </w:pPr>
+      <w:r>
+        <w:rPr>
+          <w:rFonts w:ascii="Times New Roman" w:eastAsia="Times New Roman" w:hAnsi="Times New Roman" w:cs="Times New Roman"/>
+          <w:bCs/>
+          <w:sz w:val="20"/>
+          <w:szCs w:val="24"/>
+        </w:rPr>
+        <w:t>Follow the script instructions via the terminal window</w:t>
+      </w:r>
+    </w:p>
+    <w:p>
+      <w:pPr>
+        <w:pStyle w:val="ListParagraph"/>
+        <w:numPr>
+          <w:ilvl w:val="1"/>
+          <w:numId w:val="3"/>
+        </w:numPr>
+        <w:spacing w:after="0" w:line="240" w:lineRule="auto"/>
+        <w:rPr>
+          <w:rFonts w:ascii="Times New Roman" w:eastAsia="Times New Roman" w:hAnsi="Times New Roman" w:cs="Times New Roman"/>
+          <w:bCs/>
+          <w:sz w:val="20"/>
+          <w:szCs w:val="24"/>
+        </w:rPr>
+      </w:pPr>
+      <w:r>
+        <w:rPr>
+          <w:rFonts w:ascii="Times New Roman" w:eastAsia="Times New Roman" w:hAnsi="Times New Roman" w:cs="Times New Roman"/>
+          <w:bCs/>
+          <w:sz w:val="20"/>
+          <w:szCs w:val="24"/>
+        </w:rPr>
+        <w:t>Script takes a while to run (~50min).</w:t>
+      </w:r>
+    </w:p>
+    <w:p>
+      <w:pPr>
+        <w:pStyle w:val="ListParagraph"/>
+        <w:numPr>
+          <w:ilvl w:val="1"/>
+          <w:numId w:val="3"/>
+        </w:numPr>
+        <w:spacing w:after="0" w:line="240" w:lineRule="auto"/>
+        <w:rPr>
+          <w:rFonts w:ascii="Times New Roman" w:eastAsia="Times New Roman" w:hAnsi="Times New Roman" w:cs="Times New Roman"/>
+          <w:bCs/>
+          <w:sz w:val="20"/>
+          <w:szCs w:val="24"/>
+        </w:rPr>
+      </w:pPr>
+      <w:r>
+        <w:rPr>
+          <w:rFonts w:ascii="Times New Roman" w:eastAsia="Times New Roman" w:hAnsi="Times New Roman" w:cs="Times New Roman"/>
+          <w:bCs/>
+          <w:sz w:val="20"/>
+          <w:szCs w:val="24"/>
+        </w:rPr>
+        <w:t xml:space="preserve">Script will generate a new directory (if not already done) in </w:t>
+      </w:r>
+      <w:r>
+        <w:rPr>
+          <w:rFonts w:ascii="Times New Roman" w:eastAsia="Times New Roman" w:hAnsi="Times New Roman" w:cs="Times New Roman"/>
+          <w:b/>
+          <w:sz w:val="20"/>
+          <w:szCs w:val="24"/>
+        </w:rPr>
+        <w:t>\\noodle\FOT\engineering\ccdm\Current_CCDM_Files\Quarterly Report</w:t>
+      </w:r>
     </w:p>
     <w:p>
       <w:pPr>
@@ -225,6 +649,15 @@
         </w:rPr>
         <w:t>Generate BEAT reports for period</w:t>
       </w:r>
+      <w:r>
+        <w:rPr>
+          <w:rFonts w:ascii="Times New Roman" w:eastAsia="Times New Roman" w:hAnsi="Times New Roman" w:cs="Times New Roman"/>
+          <w:b/>
+          <w:sz w:val="20"/>
+          <w:szCs w:val="24"/>
+        </w:rPr>
+        <w:t>, when prompted by ccdm_biannual.py script</w:t>
+      </w:r>
     </w:p>
     <w:p>
       <w:pPr>
@@ -278,7 +711,7 @@
       <w:r>
         <w:rPr>
           <w:rFonts w:ascii="Times New Roman" w:eastAsia="Times New Roman" w:hAnsi="Times New Roman" w:cs="Times New Roman"/>
-          <w:bCs/>
+          <w:b/>
           <w:sz w:val="20"/>
           <w:szCs w:val="24"/>
         </w:rPr>
@@ -288,44 +721,17 @@
       <w:r>
         <w:rPr>
           <w:rFonts w:ascii="Times New Roman" w:eastAsia="Times New Roman" w:hAnsi="Times New Roman" w:cs="Times New Roman"/>
-          <w:bCs/>
-          <w:sz w:val="20"/>
-          <w:szCs w:val="24"/>
-        </w:rPr>
-        <w:t>M</w:t>
-      </w:r>
-      <w:r>
-        <w:rPr>
-          <w:rFonts w:ascii="Times New Roman" w:eastAsia="Times New Roman" w:hAnsi="Times New Roman" w:cs="Times New Roman"/>
-          <w:bCs/>
-          <w:sz w:val="20"/>
-          <w:szCs w:val="24"/>
-        </w:rPr>
-        <w:t>oba</w:t>
-      </w:r>
-      <w:r>
-        <w:rPr>
-          <w:rFonts w:ascii="Times New Roman" w:eastAsia="Times New Roman" w:hAnsi="Times New Roman" w:cs="Times New Roman"/>
-          <w:bCs/>
-          <w:sz w:val="20"/>
-          <w:szCs w:val="24"/>
-        </w:rPr>
-        <w:t>X</w:t>
-      </w:r>
-      <w:r>
-        <w:rPr>
-          <w:rFonts w:ascii="Times New Roman" w:eastAsia="Times New Roman" w:hAnsi="Times New Roman" w:cs="Times New Roman"/>
-          <w:bCs/>
-          <w:sz w:val="20"/>
-          <w:szCs w:val="24"/>
-        </w:rPr>
-        <w:t>term</w:t>
+          <w:b/>
+          <w:sz w:val="20"/>
+          <w:szCs w:val="24"/>
+        </w:rPr>
+        <w:t>MobaXterm</w:t>
       </w:r>
       <w:proofErr w:type="spellEnd"/>
       <w:r>
         <w:rPr>
           <w:rFonts w:ascii="Times New Roman" w:eastAsia="Times New Roman" w:hAnsi="Times New Roman" w:cs="Times New Roman"/>
-          <w:bCs/>
+          <w:b/>
           <w:sz w:val="20"/>
           <w:szCs w:val="24"/>
         </w:rPr>
@@ -430,6 +836,60 @@
         </w:rPr>
         <w:t>cd into directory “/home/production/BEAT/bin”</w:t>
       </w:r>
+      <w:r>
+        <w:rPr>
+          <w:rFonts w:ascii="Times New Roman" w:eastAsia="Times New Roman" w:hAnsi="Times New Roman" w:cs="Times New Roman"/>
+          <w:bCs/>
+          <w:sz w:val="20"/>
+          <w:szCs w:val="24"/>
+        </w:rPr>
+        <w:t xml:space="preserve">, in </w:t>
+      </w:r>
+      <w:proofErr w:type="spellStart"/>
+      <w:r>
+        <w:rPr>
+          <w:rFonts w:ascii="Times New Roman" w:eastAsia="Times New Roman" w:hAnsi="Times New Roman" w:cs="Times New Roman"/>
+          <w:bCs/>
+          <w:sz w:val="20"/>
+          <w:szCs w:val="24"/>
+        </w:rPr>
+        <w:t>mobaxterm</w:t>
+      </w:r>
+      <w:proofErr w:type="spellEnd"/>
+    </w:p>
+    <w:p>
+      <w:pPr>
+        <w:pStyle w:val="ListParagraph"/>
+        <w:numPr>
+          <w:ilvl w:val="3"/>
+          <w:numId w:val="3"/>
+        </w:numPr>
+        <w:spacing w:after="0" w:line="240" w:lineRule="auto"/>
+        <w:rPr>
+          <w:rFonts w:ascii="Times New Roman" w:eastAsia="Times New Roman" w:hAnsi="Times New Roman" w:cs="Times New Roman"/>
+          <w:b/>
+          <w:sz w:val="20"/>
+          <w:szCs w:val="24"/>
+        </w:rPr>
+      </w:pPr>
+      <w:r>
+        <w:rPr>
+          <w:rFonts w:ascii="Times New Roman" w:eastAsia="Times New Roman" w:hAnsi="Times New Roman" w:cs="Times New Roman"/>
+          <w:b/>
+          <w:sz w:val="20"/>
+          <w:szCs w:val="24"/>
+        </w:rPr>
+        <w:t xml:space="preserve">“cd </w:t>
+      </w:r>
+      <w:r>
+        <w:rPr>
+          <w:rFonts w:ascii="Times New Roman" w:eastAsia="Times New Roman" w:hAnsi="Times New Roman" w:cs="Times New Roman"/>
+          <w:b/>
+          <w:sz w:val="20"/>
+          <w:szCs w:val="24"/>
+        </w:rPr>
+        <w:t>/home/production/BEAT/bin”</w:t>
+      </w:r>
     </w:p>
     <w:p>
       <w:pPr>
@@ -453,24 +913,47 @@
           <w:sz w:val="20"/>
           <w:szCs w:val="24"/>
         </w:rPr>
-        <w:t xml:space="preserve">launch BEAT tool as follows </w:t>
-      </w:r>
-      <w:proofErr w:type="gramStart"/>
-      <w:r>
-        <w:rPr>
-          <w:rFonts w:ascii="Times New Roman" w:eastAsia="Times New Roman" w:hAnsi="Times New Roman" w:cs="Times New Roman"/>
-          <w:bCs/>
-          <w:sz w:val="20"/>
-          <w:szCs w:val="24"/>
-        </w:rPr>
-        <w:t>(./</w:t>
+        <w:t>launch BEAT tool</w:t>
+      </w:r>
+    </w:p>
+    <w:p>
+      <w:pPr>
+        <w:pStyle w:val="ListParagraph"/>
+        <w:numPr>
+          <w:ilvl w:val="3"/>
+          <w:numId w:val="3"/>
+        </w:numPr>
+        <w:spacing w:after="0" w:line="240" w:lineRule="auto"/>
+        <w:rPr>
+          <w:rFonts w:ascii="Times New Roman" w:eastAsia="Times New Roman" w:hAnsi="Times New Roman" w:cs="Times New Roman"/>
+          <w:b/>
+          <w:sz w:val="20"/>
+          <w:szCs w:val="24"/>
+        </w:rPr>
+      </w:pPr>
+      <w:r>
+        <w:rPr>
+          <w:rFonts w:ascii="Times New Roman" w:eastAsia="Times New Roman" w:hAnsi="Times New Roman" w:cs="Times New Roman"/>
+          <w:b/>
+          <w:sz w:val="20"/>
+          <w:szCs w:val="24"/>
+        </w:rPr>
+        <w:t>“</w:t>
+      </w:r>
+      <w:r>
+        <w:rPr>
+          <w:rFonts w:ascii="Times New Roman" w:eastAsia="Times New Roman" w:hAnsi="Times New Roman" w:cs="Times New Roman"/>
+          <w:b/>
+          <w:sz w:val="20"/>
+          <w:szCs w:val="24"/>
+        </w:rPr>
+        <w:t>./</w:t>
       </w:r>
       <w:proofErr w:type="spellStart"/>
-      <w:proofErr w:type="gramEnd"/>
-      <w:r>
-        <w:rPr>
-          <w:rFonts w:ascii="Times New Roman" w:eastAsia="Times New Roman" w:hAnsi="Times New Roman" w:cs="Times New Roman"/>
-          <w:bCs/>
+      <w:r>
+        <w:rPr>
+          <w:rFonts w:ascii="Times New Roman" w:eastAsia="Times New Roman" w:hAnsi="Times New Roman" w:cs="Times New Roman"/>
+          <w:b/>
           <w:sz w:val="20"/>
           <w:szCs w:val="24"/>
         </w:rPr>
@@ -480,12 +963,41 @@
       <w:r>
         <w:rPr>
           <w:rFonts w:ascii="Times New Roman" w:eastAsia="Times New Roman" w:hAnsi="Times New Roman" w:cs="Times New Roman"/>
-          <w:bCs/>
-          <w:sz w:val="20"/>
-          <w:szCs w:val="24"/>
-        </w:rPr>
-        <w:t xml:space="preserve"> &amp;)</w:t>
-      </w:r>
+          <w:b/>
+          <w:sz w:val="20"/>
+          <w:szCs w:val="24"/>
+        </w:rPr>
+        <w:t xml:space="preserve"> &amp;</w:t>
+      </w:r>
+      <w:r>
+        <w:rPr>
+          <w:rFonts w:ascii="Times New Roman" w:eastAsia="Times New Roman" w:hAnsi="Times New Roman" w:cs="Times New Roman"/>
+          <w:b/>
+          <w:sz w:val="20"/>
+          <w:szCs w:val="24"/>
+        </w:rPr>
+        <w:t>”</w:t>
+      </w:r>
+      <w:r>
+        <w:rPr>
+          <w:rFonts w:ascii="Times New Roman" w:eastAsia="Times New Roman" w:hAnsi="Times New Roman" w:cs="Times New Roman"/>
+          <w:bCs/>
+          <w:sz w:val="20"/>
+          <w:szCs w:val="24"/>
+        </w:rPr>
+        <w:t xml:space="preserve">, in </w:t>
+      </w:r>
+      <w:proofErr w:type="spellStart"/>
+      <w:r>
+        <w:rPr>
+          <w:rFonts w:ascii="Times New Roman" w:eastAsia="Times New Roman" w:hAnsi="Times New Roman" w:cs="Times New Roman"/>
+          <w:bCs/>
+          <w:sz w:val="20"/>
+          <w:szCs w:val="24"/>
+        </w:rPr>
+        <w:t>mobaxterm</w:t>
+      </w:r>
+      <w:proofErr w:type="spellEnd"/>
     </w:p>
     <w:p>
       <w:pPr>
@@ -534,7 +1046,16 @@
           <w:sz w:val="20"/>
           <w:szCs w:val="24"/>
         </w:rPr>
-        <w:t>Click “database”</w:t>
+        <w:t xml:space="preserve">Click </w:t>
+      </w:r>
+      <w:r>
+        <w:rPr>
+          <w:rFonts w:ascii="Times New Roman" w:eastAsia="Times New Roman" w:hAnsi="Times New Roman" w:cs="Times New Roman"/>
+          <w:b/>
+          <w:sz w:val="20"/>
+          <w:szCs w:val="24"/>
+        </w:rPr>
+        <w:t>“database”</w:t>
       </w:r>
     </w:p>
     <w:p>
@@ -629,7 +1150,16 @@
           <w:sz w:val="20"/>
           <w:szCs w:val="24"/>
         </w:rPr>
-        <w:t>Click “Run”</w:t>
+        <w:t xml:space="preserve">Click </w:t>
+      </w:r>
+      <w:r>
+        <w:rPr>
+          <w:rFonts w:ascii="Times New Roman" w:eastAsia="Times New Roman" w:hAnsi="Times New Roman" w:cs="Times New Roman"/>
+          <w:b/>
+          <w:sz w:val="20"/>
+          <w:szCs w:val="24"/>
+        </w:rPr>
+        <w:t>“Run”</w:t>
       </w:r>
     </w:p>
     <w:p>
@@ -654,7 +1184,7 @@
           <w:sz w:val="20"/>
           <w:szCs w:val="24"/>
         </w:rPr>
-        <w:t>Select “All”</w:t>
+        <w:t>Input username/password when prompted</w:t>
       </w:r>
     </w:p>
     <w:p>
@@ -675,6 +1205,40 @@
       <w:r>
         <w:rPr>
           <w:rFonts w:ascii="Times New Roman" w:eastAsia="Times New Roman" w:hAnsi="Times New Roman" w:cs="Times New Roman"/>
+          <w:bCs/>
+          <w:sz w:val="20"/>
+          <w:szCs w:val="24"/>
+        </w:rPr>
+        <w:t xml:space="preserve">Select </w:t>
+      </w:r>
+      <w:r>
+        <w:rPr>
+          <w:rFonts w:ascii="Times New Roman" w:eastAsia="Times New Roman" w:hAnsi="Times New Roman" w:cs="Times New Roman"/>
+          <w:b/>
+          <w:sz w:val="20"/>
+          <w:szCs w:val="24"/>
+        </w:rPr>
+        <w:t>“All”</w:t>
+      </w:r>
+    </w:p>
+    <w:p>
+      <w:pPr>
+        <w:pStyle w:val="ListParagraph"/>
+        <w:numPr>
+          <w:ilvl w:val="2"/>
+          <w:numId w:val="3"/>
+        </w:numPr>
+        <w:spacing w:after="0" w:line="240" w:lineRule="auto"/>
+        <w:rPr>
+          <w:rFonts w:ascii="Times New Roman" w:eastAsia="Times New Roman" w:hAnsi="Times New Roman" w:cs="Times New Roman"/>
+          <w:bCs/>
+          <w:sz w:val="20"/>
+          <w:szCs w:val="24"/>
+        </w:rPr>
+      </w:pPr>
+      <w:r>
+        <w:rPr>
+          <w:rFonts w:ascii="Times New Roman" w:eastAsia="Times New Roman" w:hAnsi="Times New Roman" w:cs="Times New Roman"/>
           <w:b/>
           <w:sz w:val="20"/>
           <w:szCs w:val="24"/>
@@ -741,6 +1305,7 @@
         <w:rPr>
           <w:rFonts w:ascii="Times New Roman" w:eastAsia="Times New Roman" w:hAnsi="Times New Roman" w:cs="Times New Roman"/>
           <w:bCs/>
+          <w:noProof/>
           <w:sz w:val="20"/>
           <w:szCs w:val="24"/>
         </w:rPr>
@@ -807,9 +1372,11 @@
         <w:rPr>
           <w:rFonts w:ascii="Times New Roman" w:eastAsia="Times New Roman" w:hAnsi="Times New Roman" w:cs="Times New Roman"/>
           <w:b/>
-          <w:sz w:val="20"/>
-          <w:szCs w:val="24"/>
-        </w:rPr>
+          <w:noProof/>
+          <w:sz w:val="20"/>
+          <w:szCs w:val="24"/>
+        </w:rPr>
+        <w:lastRenderedPageBreak/>
         <w:drawing>
           <wp:inline distT="0" distB="0" distL="0" distR="0" wp14:anchorId="1E230B3E" wp14:editId="4B312725">
             <wp:extent cx="3860358" cy="1324730"/>
@@ -905,27 +1472,24 @@
           <w:sz w:val="20"/>
           <w:szCs w:val="24"/>
         </w:rPr>
-        <w:lastRenderedPageBreak/>
-        <w:t xml:space="preserve">Generate all SKA data </w:t>
-      </w:r>
-      <w:r>
-        <w:rPr>
-          <w:rFonts w:ascii="Times New Roman" w:eastAsia="Times New Roman" w:hAnsi="Times New Roman" w:cs="Times New Roman"/>
-          <w:b/>
-          <w:sz w:val="20"/>
-          <w:szCs w:val="24"/>
-        </w:rPr>
-        <w:t xml:space="preserve">plots </w:t>
-      </w:r>
-      <w:r>
-        <w:rPr>
-          <w:rFonts w:ascii="Times New Roman" w:eastAsia="Times New Roman" w:hAnsi="Times New Roman" w:cs="Times New Roman"/>
-          <w:b/>
-          <w:sz w:val="20"/>
-          <w:szCs w:val="24"/>
-        </w:rPr>
-        <w:t xml:space="preserve">for biannual period (via </w:t>
-      </w:r>
+        <w:t>Following ccdm_biannual.py script, copy all Marshall Monthly files.</w:t>
+      </w:r>
+    </w:p>
+    <w:p>
+      <w:pPr>
+        <w:pStyle w:val="ListParagraph"/>
+        <w:numPr>
+          <w:ilvl w:val="1"/>
+          <w:numId w:val="3"/>
+        </w:numPr>
+        <w:spacing w:after="0" w:line="240" w:lineRule="auto"/>
+        <w:rPr>
+          <w:rFonts w:ascii="Times New Roman" w:eastAsia="Times New Roman" w:hAnsi="Times New Roman" w:cs="Times New Roman"/>
+          <w:b/>
+          <w:sz w:val="20"/>
+          <w:szCs w:val="24"/>
+        </w:rPr>
+      </w:pPr>
       <w:proofErr w:type="spellStart"/>
       <w:r>
         <w:rPr>
@@ -934,24 +1498,26 @@
           <w:sz w:val="20"/>
           <w:szCs w:val="24"/>
         </w:rPr>
-        <w:t>chimchim</w:t>
+        <w:t>Asdf</w:t>
       </w:r>
       <w:proofErr w:type="spellEnd"/>
-      <w:r>
-        <w:rPr>
-          <w:rFonts w:ascii="Times New Roman" w:eastAsia="Times New Roman" w:hAnsi="Times New Roman" w:cs="Times New Roman"/>
-          <w:b/>
-          <w:sz w:val="20"/>
-          <w:szCs w:val="24"/>
-        </w:rPr>
-        <w:t>)</w:t>
-      </w:r>
-    </w:p>
-    <w:p>
-      <w:pPr>
-        <w:pStyle w:val="ListParagraph"/>
-        <w:numPr>
-          <w:ilvl w:val="1"/>
+    </w:p>
+    <w:p>
+      <w:pPr>
+        <w:spacing w:after="0" w:line="240" w:lineRule="auto"/>
+        <w:rPr>
+          <w:rFonts w:ascii="Times New Roman" w:eastAsia="Times New Roman" w:hAnsi="Times New Roman" w:cs="Times New Roman"/>
+          <w:b/>
+          <w:sz w:val="20"/>
+          <w:szCs w:val="24"/>
+        </w:rPr>
+      </w:pPr>
+    </w:p>
+    <w:p>
+      <w:pPr>
+        <w:pStyle w:val="ListParagraph"/>
+        <w:numPr>
+          <w:ilvl w:val="0"/>
           <w:numId w:val="3"/>
         </w:numPr>
         <w:tabs>
@@ -960,66 +1526,53 @@
         <w:spacing w:after="0" w:line="240" w:lineRule="auto"/>
         <w:rPr>
           <w:rFonts w:ascii="Times New Roman" w:eastAsia="Times New Roman" w:hAnsi="Times New Roman" w:cs="Times New Roman"/>
-          <w:bCs/>
-          <w:sz w:val="20"/>
-          <w:szCs w:val="24"/>
-        </w:rPr>
-      </w:pPr>
-      <w:r>
-        <w:rPr>
-          <w:rFonts w:ascii="Times New Roman" w:eastAsia="Times New Roman" w:hAnsi="Times New Roman" w:cs="Times New Roman"/>
-          <w:bCs/>
-          <w:sz w:val="20"/>
-          <w:szCs w:val="24"/>
-        </w:rPr>
-        <w:t xml:space="preserve">SSH into </w:t>
-      </w:r>
-      <w:proofErr w:type="spellStart"/>
-      <w:r>
-        <w:rPr>
-          <w:rFonts w:ascii="Times New Roman" w:eastAsia="Times New Roman" w:hAnsi="Times New Roman" w:cs="Times New Roman"/>
-          <w:bCs/>
-          <w:sz w:val="20"/>
-          <w:szCs w:val="24"/>
-        </w:rPr>
-        <w:t>chimchim</w:t>
-      </w:r>
-      <w:proofErr w:type="spellEnd"/>
-      <w:r>
-        <w:rPr>
-          <w:rFonts w:ascii="Times New Roman" w:eastAsia="Times New Roman" w:hAnsi="Times New Roman" w:cs="Times New Roman"/>
-          <w:bCs/>
-          <w:sz w:val="20"/>
-          <w:szCs w:val="24"/>
-        </w:rPr>
-        <w:t xml:space="preserve"> via a terminal (or </w:t>
-      </w:r>
-      <w:proofErr w:type="spellStart"/>
-      <w:r>
-        <w:rPr>
-          <w:rFonts w:ascii="Times New Roman" w:eastAsia="Times New Roman" w:hAnsi="Times New Roman" w:cs="Times New Roman"/>
-          <w:bCs/>
-          <w:sz w:val="20"/>
-          <w:szCs w:val="24"/>
-        </w:rPr>
-        <w:t>vscode</w:t>
-      </w:r>
-      <w:proofErr w:type="spellEnd"/>
-      <w:r>
-        <w:rPr>
-          <w:rFonts w:ascii="Times New Roman" w:eastAsia="Times New Roman" w:hAnsi="Times New Roman" w:cs="Times New Roman"/>
-          <w:bCs/>
-          <w:sz w:val="20"/>
-          <w:szCs w:val="24"/>
-        </w:rPr>
-        <w:t xml:space="preserve"> or whatever)</w:t>
-      </w:r>
-    </w:p>
-    <w:p>
-      <w:pPr>
-        <w:pStyle w:val="ListParagraph"/>
-        <w:numPr>
-          <w:ilvl w:val="2"/>
+          <w:b/>
+          <w:sz w:val="20"/>
+          <w:szCs w:val="24"/>
+        </w:rPr>
+      </w:pPr>
+      <w:r>
+        <w:rPr>
+          <w:rFonts w:ascii="Times New Roman" w:eastAsia="Times New Roman" w:hAnsi="Times New Roman" w:cs="Times New Roman"/>
+          <w:b/>
+          <w:sz w:val="20"/>
+          <w:szCs w:val="24"/>
+        </w:rPr>
+        <w:t xml:space="preserve">Generate all SKA data </w:t>
+      </w:r>
+      <w:r>
+        <w:rPr>
+          <w:rFonts w:ascii="Times New Roman" w:eastAsia="Times New Roman" w:hAnsi="Times New Roman" w:cs="Times New Roman"/>
+          <w:b/>
+          <w:sz w:val="20"/>
+          <w:szCs w:val="24"/>
+        </w:rPr>
+        <w:t xml:space="preserve">plots </w:t>
+      </w:r>
+      <w:r>
+        <w:rPr>
+          <w:rFonts w:ascii="Times New Roman" w:eastAsia="Times New Roman" w:hAnsi="Times New Roman" w:cs="Times New Roman"/>
+          <w:b/>
+          <w:sz w:val="20"/>
+          <w:szCs w:val="24"/>
+        </w:rPr>
+        <w:t xml:space="preserve">for biannual period </w:t>
+      </w:r>
+      <w:r>
+        <w:rPr>
+          <w:rFonts w:ascii="Times New Roman" w:eastAsia="Times New Roman" w:hAnsi="Times New Roman" w:cs="Times New Roman"/>
+          <w:b/>
+          <w:sz w:val="20"/>
+          <w:szCs w:val="24"/>
+        </w:rPr>
+        <w:t>when prompted by ccdm_biannual.py script.</w:t>
+      </w:r>
+    </w:p>
+    <w:p>
+      <w:pPr>
+        <w:pStyle w:val="ListParagraph"/>
+        <w:numPr>
+          <w:ilvl w:val="1"/>
           <w:numId w:val="3"/>
         </w:numPr>
         <w:tabs>
@@ -1036,950 +1589,536 @@
       <w:r>
         <w:rPr>
           <w:rFonts w:ascii="Times New Roman" w:eastAsia="Times New Roman" w:hAnsi="Times New Roman" w:cs="Times New Roman"/>
-          <w:b/>
-          <w:sz w:val="20"/>
-          <w:szCs w:val="24"/>
-        </w:rPr>
-        <w:t>“</w:t>
+          <w:bCs/>
+          <w:sz w:val="20"/>
+          <w:szCs w:val="24"/>
+        </w:rPr>
+        <w:t>Follow</w:t>
+      </w:r>
+    </w:p>
+    <w:p>
+      <w:pPr>
+        <w:spacing w:after="0" w:line="240" w:lineRule="auto"/>
+        <w:rPr>
+          <w:rFonts w:ascii="Times New Roman" w:eastAsia="Times New Roman" w:hAnsi="Times New Roman" w:cs="Times New Roman"/>
+          <w:bCs/>
+          <w:sz w:val="20"/>
+          <w:szCs w:val="24"/>
+        </w:rPr>
+      </w:pPr>
+    </w:p>
+    <w:p>
+      <w:pPr>
+        <w:pStyle w:val="ListParagraph"/>
+        <w:numPr>
+          <w:ilvl w:val="0"/>
+          <w:numId w:val="3"/>
+        </w:numPr>
+        <w:spacing w:after="0" w:line="240" w:lineRule="auto"/>
+        <w:rPr>
+          <w:rFonts w:ascii="Times New Roman" w:eastAsia="Times New Roman" w:hAnsi="Times New Roman" w:cs="Times New Roman"/>
+          <w:b/>
+          <w:sz w:val="20"/>
+          <w:szCs w:val="24"/>
+        </w:rPr>
+      </w:pPr>
+      <w:r>
+        <w:rPr>
+          <w:rFonts w:ascii="Times New Roman" w:eastAsia="Times New Roman" w:hAnsi="Times New Roman" w:cs="Times New Roman"/>
+          <w:b/>
+          <w:sz w:val="20"/>
+          <w:szCs w:val="24"/>
+        </w:rPr>
+        <w:t>Compile auto-generated items into report.</w:t>
+      </w:r>
+    </w:p>
+    <w:p>
+      <w:pPr>
+        <w:pStyle w:val="ListParagraph"/>
+        <w:numPr>
+          <w:ilvl w:val="1"/>
+          <w:numId w:val="3"/>
+        </w:numPr>
+        <w:spacing w:after="0" w:line="240" w:lineRule="auto"/>
+        <w:rPr>
+          <w:rFonts w:ascii="Times New Roman" w:eastAsia="Times New Roman" w:hAnsi="Times New Roman" w:cs="Times New Roman"/>
+          <w:bCs/>
+          <w:sz w:val="20"/>
+          <w:szCs w:val="24"/>
+        </w:rPr>
+      </w:pPr>
+      <w:r>
+        <w:rPr>
+          <w:rFonts w:ascii="Times New Roman" w:eastAsia="Times New Roman" w:hAnsi="Times New Roman" w:cs="Times New Roman"/>
+          <w:bCs/>
+          <w:sz w:val="20"/>
+          <w:szCs w:val="24"/>
+        </w:rPr>
+        <w:t>The following items will be auto-</w:t>
       </w:r>
       <w:proofErr w:type="spellStart"/>
-      <w:proofErr w:type="gramStart"/>
-      <w:r>
-        <w:rPr>
-          <w:rFonts w:ascii="Times New Roman" w:eastAsia="Times New Roman" w:hAnsi="Times New Roman" w:cs="Times New Roman"/>
-          <w:b/>
-          <w:sz w:val="20"/>
-          <w:szCs w:val="24"/>
-        </w:rPr>
-        <w:t>ssh</w:t>
+      <w:r>
+        <w:rPr>
+          <w:rFonts w:ascii="Times New Roman" w:eastAsia="Times New Roman" w:hAnsi="Times New Roman" w:cs="Times New Roman"/>
+          <w:bCs/>
+          <w:sz w:val="20"/>
+          <w:szCs w:val="24"/>
+        </w:rPr>
+        <w:t>gen’ed</w:t>
       </w:r>
       <w:proofErr w:type="spellEnd"/>
-      <w:proofErr w:type="gramEnd"/>
-      <w:r>
-        <w:rPr>
-          <w:rFonts w:ascii="Times New Roman" w:eastAsia="Times New Roman" w:hAnsi="Times New Roman" w:cs="Times New Roman"/>
-          <w:b/>
-          <w:sz w:val="20"/>
-          <w:szCs w:val="24"/>
-        </w:rPr>
-        <w:t xml:space="preserve"> </w:t>
+      <w:r>
+        <w:rPr>
+          <w:rFonts w:ascii="Times New Roman" w:eastAsia="Times New Roman" w:hAnsi="Times New Roman" w:cs="Times New Roman"/>
+          <w:bCs/>
+          <w:sz w:val="20"/>
+          <w:szCs w:val="24"/>
+        </w:rPr>
+        <w:t xml:space="preserve"> by the “</w:t>
+      </w:r>
+      <w:r>
+        <w:rPr>
+          <w:rFonts w:ascii="Times New Roman" w:eastAsia="Times New Roman" w:hAnsi="Times New Roman" w:cs="Times New Roman"/>
+          <w:bCs/>
+          <w:sz w:val="20"/>
+          <w:szCs w:val="24"/>
+        </w:rPr>
+        <w:t>ccdm_biannual</w:t>
+      </w:r>
+      <w:r>
+        <w:rPr>
+          <w:rFonts w:ascii="Times New Roman" w:eastAsia="Times New Roman" w:hAnsi="Times New Roman" w:cs="Times New Roman"/>
+          <w:bCs/>
+          <w:sz w:val="20"/>
+          <w:szCs w:val="24"/>
+        </w:rPr>
+        <w:t>.py” script</w:t>
+      </w:r>
+    </w:p>
+    <w:p>
+      <w:pPr>
+        <w:pStyle w:val="ListParagraph"/>
+        <w:numPr>
+          <w:ilvl w:val="2"/>
+          <w:numId w:val="3"/>
+        </w:numPr>
+        <w:spacing w:after="0" w:line="240" w:lineRule="auto"/>
+        <w:rPr>
+          <w:rFonts w:ascii="Times New Roman" w:eastAsia="Times New Roman" w:hAnsi="Times New Roman" w:cs="Times New Roman"/>
+          <w:bCs/>
+          <w:sz w:val="20"/>
+          <w:szCs w:val="24"/>
+        </w:rPr>
+      </w:pPr>
+      <w:r>
+        <w:rPr>
+          <w:rFonts w:ascii="Times New Roman" w:eastAsia="Times New Roman" w:hAnsi="Times New Roman" w:cs="Times New Roman"/>
+          <w:bCs/>
+          <w:sz w:val="20"/>
+          <w:szCs w:val="24"/>
+        </w:rPr>
+        <w:t>6</w:t>
+      </w:r>
+      <w:r>
+        <w:rPr>
+          <w:rFonts w:ascii="Times New Roman" w:eastAsia="Times New Roman" w:hAnsi="Times New Roman" w:cs="Times New Roman"/>
+          <w:bCs/>
+          <w:sz w:val="20"/>
+          <w:szCs w:val="24"/>
+        </w:rPr>
+        <w:t>3</w:t>
+      </w:r>
+      <w:r>
+        <w:rPr>
+          <w:rFonts w:ascii="Times New Roman" w:eastAsia="Times New Roman" w:hAnsi="Times New Roman" w:cs="Times New Roman"/>
+          <w:bCs/>
+          <w:sz w:val="20"/>
+          <w:szCs w:val="24"/>
+        </w:rPr>
+        <w:t xml:space="preserve">x </w:t>
+      </w:r>
+      <w:r>
+        <w:rPr>
+          <w:rFonts w:ascii="Times New Roman" w:eastAsia="Times New Roman" w:hAnsi="Times New Roman" w:cs="Times New Roman"/>
+          <w:bCs/>
+          <w:sz w:val="20"/>
+          <w:szCs w:val="24"/>
+        </w:rPr>
+        <w:t>total files are generated</w:t>
+      </w:r>
+    </w:p>
+    <w:p>
+      <w:pPr>
+        <w:pStyle w:val="ListParagraph"/>
+        <w:numPr>
+          <w:ilvl w:val="2"/>
+          <w:numId w:val="3"/>
+        </w:numPr>
+        <w:spacing w:after="0" w:line="240" w:lineRule="auto"/>
+        <w:rPr>
+          <w:rFonts w:ascii="Times New Roman" w:eastAsia="Times New Roman" w:hAnsi="Times New Roman" w:cs="Times New Roman"/>
+          <w:bCs/>
+          <w:sz w:val="20"/>
+          <w:szCs w:val="24"/>
+        </w:rPr>
+      </w:pPr>
+      <w:r>
+        <w:rPr>
+          <w:rFonts w:ascii="Times New Roman" w:eastAsia="Times New Roman" w:hAnsi="Times New Roman" w:cs="Times New Roman"/>
+          <w:bCs/>
+          <w:sz w:val="20"/>
+          <w:szCs w:val="24"/>
+        </w:rPr>
+        <w:t>SSR html plots (8x if SSR-B was prime and 9x if SSR-A was prime)</w:t>
+      </w:r>
+    </w:p>
+    <w:p>
+      <w:pPr>
+        <w:pStyle w:val="ListParagraph"/>
+        <w:numPr>
+          <w:ilvl w:val="3"/>
+          <w:numId w:val="3"/>
+        </w:numPr>
+        <w:spacing w:after="0" w:line="240" w:lineRule="auto"/>
+        <w:rPr>
+          <w:rFonts w:ascii="Times New Roman" w:eastAsia="Times New Roman" w:hAnsi="Times New Roman" w:cs="Times New Roman"/>
+          <w:bCs/>
+          <w:sz w:val="20"/>
+          <w:szCs w:val="24"/>
+        </w:rPr>
+      </w:pPr>
+      <w:r>
+        <w:rPr>
+          <w:rFonts w:ascii="Times New Roman" w:eastAsia="Times New Roman" w:hAnsi="Times New Roman" w:cs="Times New Roman"/>
+          <w:bCs/>
+          <w:sz w:val="20"/>
+          <w:szCs w:val="24"/>
+        </w:rPr>
+        <w:t>SBE_vs_DBE_by_Date.html</w:t>
+      </w:r>
+    </w:p>
+    <w:p>
+      <w:pPr>
+        <w:pStyle w:val="ListParagraph"/>
+        <w:numPr>
+          <w:ilvl w:val="3"/>
+          <w:numId w:val="3"/>
+        </w:numPr>
+        <w:spacing w:after="0" w:line="240" w:lineRule="auto"/>
+        <w:rPr>
+          <w:rFonts w:ascii="Times New Roman" w:eastAsia="Times New Roman" w:hAnsi="Times New Roman" w:cs="Times New Roman"/>
+          <w:bCs/>
+          <w:sz w:val="20"/>
+          <w:szCs w:val="24"/>
+        </w:rPr>
+      </w:pPr>
+      <w:r>
+        <w:rPr>
+          <w:rFonts w:ascii="Times New Roman" w:eastAsia="Times New Roman" w:hAnsi="Times New Roman" w:cs="Times New Roman"/>
+          <w:bCs/>
+          <w:sz w:val="20"/>
+          <w:szCs w:val="24"/>
+        </w:rPr>
+        <w:t>SBE_vs_DBE_by_Submodule.html</w:t>
+      </w:r>
+    </w:p>
+    <w:p>
+      <w:pPr>
+        <w:pStyle w:val="ListParagraph"/>
+        <w:numPr>
+          <w:ilvl w:val="3"/>
+          <w:numId w:val="3"/>
+        </w:numPr>
+        <w:spacing w:after="0" w:line="240" w:lineRule="auto"/>
+        <w:rPr>
+          <w:rFonts w:ascii="Times New Roman" w:eastAsia="Times New Roman" w:hAnsi="Times New Roman" w:cs="Times New Roman"/>
+          <w:bCs/>
+          <w:sz w:val="20"/>
+          <w:szCs w:val="24"/>
+        </w:rPr>
+      </w:pPr>
+      <w:r>
+        <w:rPr>
+          <w:rFonts w:ascii="Times New Roman" w:eastAsia="Times New Roman" w:hAnsi="Times New Roman" w:cs="Times New Roman"/>
+          <w:bCs/>
+          <w:sz w:val="20"/>
+          <w:szCs w:val="24"/>
+        </w:rPr>
+        <w:t>Quarterly_SSR_A_by_DoY.html</w:t>
+      </w:r>
+    </w:p>
+    <w:p>
+      <w:pPr>
+        <w:pStyle w:val="ListParagraph"/>
+        <w:numPr>
+          <w:ilvl w:val="3"/>
+          <w:numId w:val="3"/>
+        </w:numPr>
+        <w:spacing w:after="0" w:line="240" w:lineRule="auto"/>
+        <w:rPr>
+          <w:rFonts w:ascii="Times New Roman" w:eastAsia="Times New Roman" w:hAnsi="Times New Roman" w:cs="Times New Roman"/>
+          <w:bCs/>
+          <w:sz w:val="20"/>
+          <w:szCs w:val="24"/>
+        </w:rPr>
+      </w:pPr>
+      <w:r>
+        <w:rPr>
+          <w:rFonts w:ascii="Times New Roman" w:eastAsia="Times New Roman" w:hAnsi="Times New Roman" w:cs="Times New Roman"/>
+          <w:bCs/>
+          <w:sz w:val="20"/>
+          <w:szCs w:val="24"/>
+        </w:rPr>
+        <w:t>Quarterly_SSR_A_by_SubMod.html</w:t>
+      </w:r>
+    </w:p>
+    <w:p>
+      <w:pPr>
+        <w:pStyle w:val="ListParagraph"/>
+        <w:numPr>
+          <w:ilvl w:val="3"/>
+          <w:numId w:val="3"/>
+        </w:numPr>
+        <w:spacing w:after="0" w:line="240" w:lineRule="auto"/>
+        <w:rPr>
+          <w:rFonts w:ascii="Times New Roman" w:eastAsia="Times New Roman" w:hAnsi="Times New Roman" w:cs="Times New Roman"/>
+          <w:bCs/>
+          <w:sz w:val="20"/>
+          <w:szCs w:val="24"/>
+        </w:rPr>
+      </w:pPr>
+      <w:r>
+        <w:rPr>
+          <w:rFonts w:ascii="Times New Roman" w:eastAsia="Times New Roman" w:hAnsi="Times New Roman" w:cs="Times New Roman"/>
+          <w:bCs/>
+          <w:sz w:val="20"/>
+          <w:szCs w:val="24"/>
+        </w:rPr>
+        <w:t>Quarterly_SSR_A_Timestrip.html</w:t>
+      </w:r>
+    </w:p>
+    <w:p>
+      <w:pPr>
+        <w:pStyle w:val="ListParagraph"/>
+        <w:numPr>
+          <w:ilvl w:val="3"/>
+          <w:numId w:val="3"/>
+        </w:numPr>
+        <w:spacing w:after="0" w:line="240" w:lineRule="auto"/>
+        <w:rPr>
+          <w:rFonts w:ascii="Times New Roman" w:eastAsia="Times New Roman" w:hAnsi="Times New Roman" w:cs="Times New Roman"/>
+          <w:bCs/>
+          <w:sz w:val="20"/>
+          <w:szCs w:val="24"/>
+        </w:rPr>
+      </w:pPr>
+      <w:r>
+        <w:rPr>
+          <w:rFonts w:ascii="Times New Roman" w:eastAsia="Times New Roman" w:hAnsi="Times New Roman" w:cs="Times New Roman"/>
+          <w:bCs/>
+          <w:sz w:val="20"/>
+          <w:szCs w:val="24"/>
+        </w:rPr>
+        <w:t>Quarterly_SSR_B_by_DoY.html</w:t>
+      </w:r>
+    </w:p>
+    <w:p>
+      <w:pPr>
+        <w:pStyle w:val="ListParagraph"/>
+        <w:numPr>
+          <w:ilvl w:val="3"/>
+          <w:numId w:val="3"/>
+        </w:numPr>
+        <w:spacing w:after="0" w:line="240" w:lineRule="auto"/>
+        <w:rPr>
+          <w:rFonts w:ascii="Times New Roman" w:eastAsia="Times New Roman" w:hAnsi="Times New Roman" w:cs="Times New Roman"/>
+          <w:bCs/>
+          <w:sz w:val="20"/>
+          <w:szCs w:val="24"/>
+        </w:rPr>
+      </w:pPr>
+      <w:r>
+        <w:rPr>
+          <w:rFonts w:ascii="Times New Roman" w:eastAsia="Times New Roman" w:hAnsi="Times New Roman" w:cs="Times New Roman"/>
+          <w:bCs/>
+          <w:sz w:val="20"/>
+          <w:szCs w:val="24"/>
+        </w:rPr>
+        <w:t>Quarterly_SSR_B_by_SubMod.html</w:t>
+      </w:r>
+    </w:p>
+    <w:p>
+      <w:pPr>
+        <w:pStyle w:val="ListParagraph"/>
+        <w:numPr>
+          <w:ilvl w:val="3"/>
+          <w:numId w:val="3"/>
+        </w:numPr>
+        <w:spacing w:after="0" w:line="240" w:lineRule="auto"/>
+        <w:rPr>
+          <w:rFonts w:ascii="Times New Roman" w:eastAsia="Times New Roman" w:hAnsi="Times New Roman" w:cs="Times New Roman"/>
+          <w:bCs/>
+          <w:sz w:val="20"/>
+          <w:szCs w:val="24"/>
+        </w:rPr>
+      </w:pPr>
+      <w:r>
+        <w:rPr>
+          <w:rFonts w:ascii="Times New Roman" w:eastAsia="Times New Roman" w:hAnsi="Times New Roman" w:cs="Times New Roman"/>
+          <w:bCs/>
+          <w:sz w:val="20"/>
+          <w:szCs w:val="24"/>
+        </w:rPr>
+        <w:t>Quarterly_SSR_B_Timestrip.html</w:t>
+      </w:r>
+    </w:p>
+    <w:p>
+      <w:pPr>
+        <w:pStyle w:val="ListParagraph"/>
+        <w:numPr>
+          <w:ilvl w:val="3"/>
+          <w:numId w:val="3"/>
+        </w:numPr>
+        <w:spacing w:after="0" w:line="240" w:lineRule="auto"/>
+        <w:rPr>
+          <w:rFonts w:ascii="Times New Roman" w:eastAsia="Times New Roman" w:hAnsi="Times New Roman" w:cs="Times New Roman"/>
+          <w:bCs/>
+          <w:sz w:val="20"/>
+          <w:szCs w:val="24"/>
+        </w:rPr>
+      </w:pPr>
+      <w:r>
+        <w:rPr>
+          <w:rFonts w:ascii="Times New Roman" w:eastAsia="Times New Roman" w:hAnsi="Times New Roman" w:cs="Times New Roman"/>
+          <w:bCs/>
+          <w:sz w:val="20"/>
+          <w:szCs w:val="24"/>
+        </w:rPr>
+        <w:t>(If SSR-A was prime) Avg_SBE_Submod104.html</w:t>
+      </w:r>
+    </w:p>
+    <w:p>
+      <w:pPr>
+        <w:pStyle w:val="ListParagraph"/>
+        <w:numPr>
+          <w:ilvl w:val="2"/>
+          <w:numId w:val="3"/>
+        </w:numPr>
+        <w:spacing w:after="0" w:line="240" w:lineRule="auto"/>
+        <w:rPr>
+          <w:rFonts w:ascii="Times New Roman" w:eastAsia="Times New Roman" w:hAnsi="Times New Roman" w:cs="Times New Roman"/>
+          <w:bCs/>
+          <w:sz w:val="20"/>
+          <w:szCs w:val="24"/>
+        </w:rPr>
+      </w:pPr>
+      <w:r>
+        <w:rPr>
+          <w:rFonts w:ascii="Times New Roman" w:eastAsia="Times New Roman" w:hAnsi="Times New Roman" w:cs="Times New Roman"/>
+          <w:bCs/>
+          <w:sz w:val="20"/>
+          <w:szCs w:val="24"/>
+        </w:rPr>
+        <w:t>CSV files containing raw data (14x)</w:t>
+      </w:r>
+    </w:p>
+    <w:p>
+      <w:pPr>
+        <w:pStyle w:val="ListParagraph"/>
+        <w:numPr>
+          <w:ilvl w:val="2"/>
+          <w:numId w:val="3"/>
+        </w:numPr>
+        <w:spacing w:after="0" w:line="240" w:lineRule="auto"/>
+        <w:rPr>
+          <w:rFonts w:ascii="Times New Roman" w:eastAsia="Times New Roman" w:hAnsi="Times New Roman" w:cs="Times New Roman"/>
+          <w:bCs/>
+          <w:sz w:val="20"/>
+          <w:szCs w:val="24"/>
+        </w:rPr>
+      </w:pPr>
+      <w:r>
+        <w:rPr>
+          <w:rFonts w:ascii="Times New Roman" w:eastAsia="Times New Roman" w:hAnsi="Times New Roman" w:cs="Times New Roman"/>
+          <w:bCs/>
+          <w:sz w:val="20"/>
+          <w:szCs w:val="24"/>
+        </w:rPr>
+        <w:t>Transmitter vs Baseplate Temp Plot (YYYYb_TX_BPT.html)</w:t>
+      </w:r>
+    </w:p>
+    <w:p>
+      <w:pPr>
+        <w:spacing w:after="0" w:line="240" w:lineRule="auto"/>
+        <w:rPr>
+          <w:rFonts w:ascii="Times New Roman" w:eastAsia="Times New Roman" w:hAnsi="Times New Roman" w:cs="Times New Roman"/>
+          <w:bCs/>
+          <w:sz w:val="20"/>
+          <w:szCs w:val="24"/>
+        </w:rPr>
+      </w:pPr>
+    </w:p>
+    <w:p>
+      <w:pPr>
+        <w:spacing w:after="0" w:line="240" w:lineRule="auto"/>
+        <w:rPr>
+          <w:rFonts w:ascii="Times New Roman" w:eastAsia="Times New Roman" w:hAnsi="Times New Roman" w:cs="Times New Roman"/>
+          <w:bCs/>
+          <w:sz w:val="20"/>
+          <w:szCs w:val="24"/>
+        </w:rPr>
+      </w:pPr>
+    </w:p>
+    <w:p>
+      <w:pPr>
+        <w:pStyle w:val="ListParagraph"/>
+        <w:numPr>
+          <w:ilvl w:val="0"/>
+          <w:numId w:val="3"/>
+        </w:numPr>
+        <w:spacing w:after="0" w:line="240" w:lineRule="auto"/>
+        <w:rPr>
+          <w:rFonts w:ascii="Times New Roman" w:eastAsia="Times New Roman" w:hAnsi="Times New Roman" w:cs="Times New Roman"/>
+          <w:b/>
+          <w:sz w:val="20"/>
+          <w:szCs w:val="24"/>
+        </w:rPr>
+      </w:pPr>
+      <w:r>
+        <w:rPr>
+          <w:rFonts w:ascii="Times New Roman" w:eastAsia="Times New Roman" w:hAnsi="Times New Roman" w:cs="Times New Roman"/>
+          <w:b/>
+          <w:sz w:val="20"/>
+          <w:szCs w:val="24"/>
+        </w:rPr>
+        <w:t>Clock Rate Data into report</w:t>
+      </w:r>
+    </w:p>
+    <w:p>
+      <w:pPr>
+        <w:pStyle w:val="ListParagraph"/>
+        <w:numPr>
+          <w:ilvl w:val="1"/>
+          <w:numId w:val="3"/>
+        </w:numPr>
+        <w:spacing w:after="0" w:line="240" w:lineRule="auto"/>
+        <w:rPr>
+          <w:rFonts w:ascii="Times New Roman" w:eastAsia="Times New Roman" w:hAnsi="Times New Roman" w:cs="Times New Roman"/>
+          <w:bCs/>
+          <w:sz w:val="20"/>
+          <w:szCs w:val="24"/>
+        </w:rPr>
+      </w:pPr>
+      <w:r>
+        <w:rPr>
+          <w:rFonts w:ascii="Times New Roman" w:eastAsia="Times New Roman" w:hAnsi="Times New Roman" w:cs="Times New Roman"/>
+          <w:bCs/>
+          <w:sz w:val="20"/>
+          <w:szCs w:val="24"/>
+        </w:rPr>
+        <w:t xml:space="preserve">From noodle directory </w:t>
       </w:r>
       <w:hyperlink r:id="rId10" w:history="1">
-        <w:r>
-          <w:rPr>
-            <w:rStyle w:val="Hyperlink"/>
-            <w:rFonts w:ascii="Times New Roman" w:eastAsia="Times New Roman" w:hAnsi="Times New Roman" w:cs="Times New Roman"/>
-            <w:b/>
-            <w:sz w:val="20"/>
-            <w:szCs w:val="24"/>
-          </w:rPr>
-          <w:t>user@131.142.113.13</w:t>
-        </w:r>
-      </w:hyperlink>
-      <w:r>
-        <w:rPr>
-          <w:rFonts w:ascii="Times New Roman" w:eastAsia="Times New Roman" w:hAnsi="Times New Roman" w:cs="Times New Roman"/>
-          <w:b/>
-          <w:sz w:val="20"/>
-          <w:szCs w:val="24"/>
-        </w:rPr>
-        <w:t>”</w:t>
-      </w:r>
-      <w:r>
-        <w:rPr>
-          <w:rFonts w:ascii="Times New Roman" w:eastAsia="Times New Roman" w:hAnsi="Times New Roman" w:cs="Times New Roman"/>
-          <w:bCs/>
-          <w:sz w:val="20"/>
-          <w:szCs w:val="24"/>
-        </w:rPr>
-        <w:t>, input password when prompted</w:t>
-      </w:r>
-    </w:p>
-    <w:p>
-      <w:pPr>
-        <w:pStyle w:val="ListParagraph"/>
-        <w:numPr>
-          <w:ilvl w:val="1"/>
-          <w:numId w:val="3"/>
-        </w:numPr>
-        <w:spacing w:after="0" w:line="240" w:lineRule="auto"/>
-        <w:rPr>
-          <w:rFonts w:ascii="Times New Roman" w:eastAsia="Times New Roman" w:hAnsi="Times New Roman" w:cs="Times New Roman"/>
-          <w:bCs/>
-          <w:sz w:val="20"/>
-          <w:szCs w:val="24"/>
-        </w:rPr>
-      </w:pPr>
-      <w:r>
-        <w:rPr>
-          <w:rFonts w:ascii="Times New Roman" w:eastAsia="Times New Roman" w:hAnsi="Times New Roman" w:cs="Times New Roman"/>
-          <w:bCs/>
-          <w:sz w:val="20"/>
-          <w:szCs w:val="24"/>
-        </w:rPr>
-        <w:t>Active the ska3flight virtual environment with the following command</w:t>
-      </w:r>
-    </w:p>
-    <w:p>
-      <w:pPr>
-        <w:pStyle w:val="ListParagraph"/>
-        <w:numPr>
-          <w:ilvl w:val="2"/>
-          <w:numId w:val="3"/>
-        </w:numPr>
-        <w:spacing w:after="0" w:line="240" w:lineRule="auto"/>
-        <w:rPr>
-          <w:rFonts w:ascii="Times New Roman" w:eastAsia="Times New Roman" w:hAnsi="Times New Roman" w:cs="Times New Roman"/>
-          <w:b/>
-          <w:sz w:val="20"/>
-          <w:szCs w:val="24"/>
-        </w:rPr>
-      </w:pPr>
-      <w:r>
-        <w:rPr>
-          <w:rFonts w:ascii="Times New Roman" w:eastAsia="Times New Roman" w:hAnsi="Times New Roman" w:cs="Times New Roman"/>
-          <w:b/>
-          <w:sz w:val="20"/>
-          <w:szCs w:val="24"/>
-        </w:rPr>
-        <w:t>ska3flight</w:t>
-      </w:r>
-    </w:p>
-    <w:p>
-      <w:pPr>
-        <w:pStyle w:val="ListParagraph"/>
-        <w:numPr>
-          <w:ilvl w:val="1"/>
-          <w:numId w:val="3"/>
-        </w:numPr>
-        <w:tabs>
-          <w:tab w:val="num" w:pos="936"/>
-        </w:tabs>
-        <w:spacing w:after="0" w:line="240" w:lineRule="auto"/>
-        <w:rPr>
-          <w:rFonts w:ascii="Times New Roman" w:eastAsia="Times New Roman" w:hAnsi="Times New Roman" w:cs="Times New Roman"/>
-          <w:bCs/>
-          <w:sz w:val="20"/>
-          <w:szCs w:val="24"/>
-        </w:rPr>
-      </w:pPr>
-      <w:r>
-        <w:rPr>
-          <w:rFonts w:ascii="Times New Roman" w:eastAsia="Times New Roman" w:hAnsi="Times New Roman" w:cs="Times New Roman"/>
-          <w:bCs/>
-          <w:sz w:val="20"/>
-          <w:szCs w:val="24"/>
-        </w:rPr>
-        <w:t>cd into the following directory with the following command</w:t>
-      </w:r>
-    </w:p>
-    <w:p>
-      <w:pPr>
-        <w:pStyle w:val="ListParagraph"/>
-        <w:numPr>
-          <w:ilvl w:val="2"/>
-          <w:numId w:val="3"/>
-        </w:numPr>
-        <w:spacing w:after="0" w:line="240" w:lineRule="auto"/>
-        <w:rPr>
-          <w:rFonts w:ascii="Times New Roman" w:eastAsia="Times New Roman" w:hAnsi="Times New Roman" w:cs="Times New Roman"/>
-          <w:b/>
-          <w:sz w:val="20"/>
-          <w:szCs w:val="24"/>
-        </w:rPr>
-      </w:pPr>
-      <w:r>
-        <w:rPr>
-          <w:rFonts w:ascii="Times New Roman" w:eastAsia="Times New Roman" w:hAnsi="Times New Roman" w:cs="Times New Roman"/>
-          <w:b/>
-          <w:sz w:val="20"/>
-          <w:szCs w:val="24"/>
-        </w:rPr>
-        <w:t>“</w:t>
-      </w:r>
-      <w:r>
-        <w:rPr>
-          <w:rFonts w:ascii="Times New Roman" w:eastAsia="Times New Roman" w:hAnsi="Times New Roman" w:cs="Times New Roman"/>
-          <w:b/>
-          <w:sz w:val="20"/>
-          <w:szCs w:val="24"/>
-        </w:rPr>
-        <w:t>cd /home/</w:t>
-      </w:r>
-      <w:proofErr w:type="spellStart"/>
-      <w:r>
-        <w:rPr>
-          <w:rFonts w:ascii="Times New Roman" w:eastAsia="Times New Roman" w:hAnsi="Times New Roman" w:cs="Times New Roman"/>
-          <w:b/>
-          <w:sz w:val="20"/>
-          <w:szCs w:val="24"/>
-        </w:rPr>
-        <w:t>rhoover</w:t>
-      </w:r>
-      <w:proofErr w:type="spellEnd"/>
-      <w:r>
-        <w:rPr>
-          <w:rFonts w:ascii="Times New Roman" w:eastAsia="Times New Roman" w:hAnsi="Times New Roman" w:cs="Times New Roman"/>
-          <w:b/>
-          <w:sz w:val="20"/>
-          <w:szCs w:val="24"/>
-        </w:rPr>
-        <w:t>/</w:t>
-      </w:r>
-      <w:r>
-        <w:rPr>
-          <w:rFonts w:ascii="Times New Roman" w:eastAsia="Times New Roman" w:hAnsi="Times New Roman" w:cs="Times New Roman"/>
-          <w:b/>
-          <w:sz w:val="20"/>
-          <w:szCs w:val="24"/>
-        </w:rPr>
-        <w:t>python/</w:t>
-      </w:r>
-      <w:r>
-        <w:rPr>
-          <w:rFonts w:ascii="Times New Roman" w:eastAsia="Times New Roman" w:hAnsi="Times New Roman" w:cs="Times New Roman"/>
-          <w:b/>
-          <w:sz w:val="20"/>
-          <w:szCs w:val="24"/>
-        </w:rPr>
-        <w:t>Code/</w:t>
-      </w:r>
-      <w:proofErr w:type="spellStart"/>
-      <w:r>
-        <w:rPr>
-          <w:rFonts w:ascii="Times New Roman" w:eastAsia="Times New Roman" w:hAnsi="Times New Roman" w:cs="Times New Roman"/>
-          <w:b/>
-          <w:sz w:val="20"/>
-          <w:szCs w:val="24"/>
-        </w:rPr>
-        <w:t>ccdm</w:t>
-      </w:r>
-      <w:proofErr w:type="spellEnd"/>
-      <w:r>
-        <w:rPr>
-          <w:rFonts w:ascii="Times New Roman" w:eastAsia="Times New Roman" w:hAnsi="Times New Roman" w:cs="Times New Roman"/>
-          <w:b/>
-          <w:sz w:val="20"/>
-          <w:szCs w:val="24"/>
-        </w:rPr>
-        <w:t>/</w:t>
-      </w:r>
-      <w:r>
-        <w:rPr>
-          <w:rFonts w:ascii="Times New Roman" w:eastAsia="Times New Roman" w:hAnsi="Times New Roman" w:cs="Times New Roman"/>
-          <w:b/>
-          <w:sz w:val="20"/>
-          <w:szCs w:val="24"/>
-        </w:rPr>
-        <w:t>Biannual/</w:t>
-      </w:r>
-      <w:r>
-        <w:rPr>
-          <w:rFonts w:ascii="Times New Roman" w:eastAsia="Times New Roman" w:hAnsi="Times New Roman" w:cs="Times New Roman"/>
-          <w:b/>
-          <w:sz w:val="20"/>
-          <w:szCs w:val="24"/>
-        </w:rPr>
-        <w:t>”</w:t>
-      </w:r>
-    </w:p>
-    <w:p>
-      <w:pPr>
-        <w:pStyle w:val="ListParagraph"/>
-        <w:numPr>
-          <w:ilvl w:val="1"/>
-          <w:numId w:val="3"/>
-        </w:numPr>
-        <w:spacing w:after="0" w:line="240" w:lineRule="auto"/>
-        <w:rPr>
-          <w:rFonts w:ascii="Times New Roman" w:eastAsia="Times New Roman" w:hAnsi="Times New Roman" w:cs="Times New Roman"/>
-          <w:bCs/>
-          <w:sz w:val="20"/>
-          <w:szCs w:val="24"/>
-        </w:rPr>
-      </w:pPr>
-      <w:r>
-        <w:rPr>
-          <w:rFonts w:ascii="Times New Roman" w:eastAsia="Times New Roman" w:hAnsi="Times New Roman" w:cs="Times New Roman"/>
-          <w:bCs/>
-          <w:sz w:val="20"/>
-          <w:szCs w:val="24"/>
-        </w:rPr>
-        <w:t>Run the CCDM Biannual Report python script with the following command</w:t>
-      </w:r>
-    </w:p>
-    <w:p>
-      <w:pPr>
-        <w:pStyle w:val="ListParagraph"/>
-        <w:numPr>
-          <w:ilvl w:val="2"/>
-          <w:numId w:val="3"/>
-        </w:numPr>
-        <w:spacing w:after="0" w:line="240" w:lineRule="auto"/>
-        <w:rPr>
-          <w:rFonts w:ascii="Times New Roman" w:eastAsia="Times New Roman" w:hAnsi="Times New Roman" w:cs="Times New Roman"/>
-          <w:b/>
-          <w:sz w:val="20"/>
-          <w:szCs w:val="24"/>
-        </w:rPr>
-      </w:pPr>
-      <w:r>
-        <w:rPr>
-          <w:rFonts w:ascii="Times New Roman" w:eastAsia="Times New Roman" w:hAnsi="Times New Roman" w:cs="Times New Roman"/>
-          <w:b/>
-          <w:sz w:val="20"/>
-          <w:szCs w:val="24"/>
-        </w:rPr>
-        <w:t>p</w:t>
-      </w:r>
-      <w:r>
-        <w:rPr>
-          <w:rFonts w:ascii="Times New Roman" w:eastAsia="Times New Roman" w:hAnsi="Times New Roman" w:cs="Times New Roman"/>
-          <w:b/>
-          <w:sz w:val="20"/>
-          <w:szCs w:val="24"/>
-        </w:rPr>
-        <w:t>ython “CCDM Biannual.py"</w:t>
-      </w:r>
-    </w:p>
-    <w:p>
-      <w:pPr>
-        <w:pStyle w:val="ListParagraph"/>
-        <w:numPr>
-          <w:ilvl w:val="1"/>
-          <w:numId w:val="3"/>
-        </w:numPr>
-        <w:spacing w:after="0" w:line="240" w:lineRule="auto"/>
-        <w:rPr>
-          <w:rFonts w:ascii="Times New Roman" w:eastAsia="Times New Roman" w:hAnsi="Times New Roman" w:cs="Times New Roman"/>
-          <w:bCs/>
-          <w:sz w:val="20"/>
-          <w:szCs w:val="24"/>
-        </w:rPr>
-      </w:pPr>
-      <w:r>
-        <w:rPr>
-          <w:rFonts w:ascii="Times New Roman" w:eastAsia="Times New Roman" w:hAnsi="Times New Roman" w:cs="Times New Roman"/>
-          <w:bCs/>
-          <w:sz w:val="20"/>
-          <w:szCs w:val="24"/>
-        </w:rPr>
-        <w:t>Follow the script instructions via the terminal window</w:t>
-      </w:r>
-    </w:p>
-    <w:p>
-      <w:pPr>
-        <w:pStyle w:val="ListParagraph"/>
-        <w:numPr>
-          <w:ilvl w:val="1"/>
-          <w:numId w:val="3"/>
-        </w:numPr>
-        <w:spacing w:after="0" w:line="240" w:lineRule="auto"/>
-        <w:rPr>
-          <w:rFonts w:ascii="Times New Roman" w:eastAsia="Times New Roman" w:hAnsi="Times New Roman" w:cs="Times New Roman"/>
-          <w:bCs/>
-          <w:sz w:val="20"/>
-          <w:szCs w:val="24"/>
-        </w:rPr>
-      </w:pPr>
-      <w:r>
-        <w:rPr>
-          <w:rFonts w:ascii="Times New Roman" w:eastAsia="Times New Roman" w:hAnsi="Times New Roman" w:cs="Times New Roman"/>
-          <w:bCs/>
-          <w:sz w:val="20"/>
-          <w:szCs w:val="24"/>
-        </w:rPr>
-        <w:t>Script takes a while to run (~50min).</w:t>
-      </w:r>
-    </w:p>
-    <w:p>
-      <w:pPr>
-        <w:pStyle w:val="ListParagraph"/>
-        <w:numPr>
-          <w:ilvl w:val="1"/>
-          <w:numId w:val="3"/>
-        </w:numPr>
-        <w:spacing w:after="0" w:line="240" w:lineRule="auto"/>
-        <w:rPr>
-          <w:rFonts w:ascii="Times New Roman" w:eastAsia="Times New Roman" w:hAnsi="Times New Roman" w:cs="Times New Roman"/>
-          <w:bCs/>
-          <w:sz w:val="20"/>
-          <w:szCs w:val="24"/>
-        </w:rPr>
-      </w:pPr>
-      <w:r>
-        <w:rPr>
-          <w:rFonts w:ascii="Times New Roman" w:eastAsia="Times New Roman" w:hAnsi="Times New Roman" w:cs="Times New Roman"/>
-          <w:bCs/>
-          <w:sz w:val="20"/>
-          <w:szCs w:val="24"/>
-        </w:rPr>
-        <w:t xml:space="preserve">Script will generate a new directory </w:t>
-      </w:r>
-      <w:r>
-        <w:rPr>
-          <w:rFonts w:ascii="Times New Roman" w:eastAsia="Times New Roman" w:hAnsi="Times New Roman" w:cs="Times New Roman"/>
-          <w:bCs/>
-          <w:sz w:val="20"/>
-          <w:szCs w:val="24"/>
-        </w:rPr>
-        <w:t xml:space="preserve">(if not already done) </w:t>
-      </w:r>
-      <w:r>
-        <w:rPr>
-          <w:rFonts w:ascii="Times New Roman" w:eastAsia="Times New Roman" w:hAnsi="Times New Roman" w:cs="Times New Roman"/>
-          <w:bCs/>
-          <w:sz w:val="20"/>
-          <w:szCs w:val="24"/>
-        </w:rPr>
-        <w:t xml:space="preserve">in </w:t>
-      </w:r>
-      <w:r>
-        <w:rPr>
-          <w:rFonts w:ascii="Times New Roman" w:eastAsia="Times New Roman" w:hAnsi="Times New Roman" w:cs="Times New Roman"/>
-          <w:b/>
-          <w:sz w:val="20"/>
-          <w:szCs w:val="24"/>
-        </w:rPr>
-        <w:t>\\noodle\FOT\engineering\ccdm\Current_CCDM_Files\Quarterly Report</w:t>
-      </w:r>
-    </w:p>
-    <w:p>
-      <w:pPr>
-        <w:spacing w:after="0" w:line="240" w:lineRule="auto"/>
-        <w:rPr>
-          <w:rFonts w:ascii="Times New Roman" w:eastAsia="Times New Roman" w:hAnsi="Times New Roman" w:cs="Times New Roman"/>
-          <w:bCs/>
-          <w:sz w:val="20"/>
-          <w:szCs w:val="24"/>
-        </w:rPr>
-      </w:pPr>
-    </w:p>
-    <w:p>
-      <w:pPr>
-        <w:spacing w:after="0" w:line="240" w:lineRule="auto"/>
-        <w:rPr>
-          <w:rFonts w:ascii="Times New Roman" w:eastAsia="Times New Roman" w:hAnsi="Times New Roman" w:cs="Times New Roman"/>
-          <w:bCs/>
-          <w:sz w:val="20"/>
-          <w:szCs w:val="24"/>
-        </w:rPr>
-      </w:pPr>
-    </w:p>
-    <w:p>
-      <w:pPr>
-        <w:pStyle w:val="ListParagraph"/>
-        <w:numPr>
-          <w:ilvl w:val="0"/>
-          <w:numId w:val="3"/>
-        </w:numPr>
-        <w:spacing w:after="0" w:line="240" w:lineRule="auto"/>
-        <w:rPr>
-          <w:rFonts w:ascii="Times New Roman" w:eastAsia="Times New Roman" w:hAnsi="Times New Roman" w:cs="Times New Roman"/>
-          <w:b/>
-          <w:sz w:val="20"/>
-          <w:szCs w:val="24"/>
-        </w:rPr>
-      </w:pPr>
-      <w:r>
-        <w:rPr>
-          <w:rFonts w:ascii="Times New Roman" w:eastAsia="Times New Roman" w:hAnsi="Times New Roman" w:cs="Times New Roman"/>
-          <w:b/>
-          <w:sz w:val="20"/>
-          <w:szCs w:val="24"/>
-        </w:rPr>
-        <w:t>Compile auto-generated items into report.</w:t>
-      </w:r>
-    </w:p>
-    <w:p>
-      <w:pPr>
-        <w:pStyle w:val="ListParagraph"/>
-        <w:numPr>
-          <w:ilvl w:val="1"/>
-          <w:numId w:val="3"/>
-        </w:numPr>
-        <w:spacing w:after="0" w:line="240" w:lineRule="auto"/>
-        <w:rPr>
-          <w:rFonts w:ascii="Times New Roman" w:eastAsia="Times New Roman" w:hAnsi="Times New Roman" w:cs="Times New Roman"/>
-          <w:bCs/>
-          <w:sz w:val="20"/>
-          <w:szCs w:val="24"/>
-        </w:rPr>
-      </w:pPr>
-      <w:r>
-        <w:rPr>
-          <w:rFonts w:ascii="Times New Roman" w:eastAsia="Times New Roman" w:hAnsi="Times New Roman" w:cs="Times New Roman"/>
-          <w:bCs/>
-          <w:sz w:val="20"/>
-          <w:szCs w:val="24"/>
-        </w:rPr>
-        <w:t>The following items will be auto-</w:t>
-      </w:r>
-      <w:proofErr w:type="spellStart"/>
-      <w:r>
-        <w:rPr>
-          <w:rFonts w:ascii="Times New Roman" w:eastAsia="Times New Roman" w:hAnsi="Times New Roman" w:cs="Times New Roman"/>
-          <w:bCs/>
-          <w:sz w:val="20"/>
-          <w:szCs w:val="24"/>
-        </w:rPr>
-        <w:t>gen’ed</w:t>
-      </w:r>
-      <w:proofErr w:type="spellEnd"/>
-      <w:r>
-        <w:rPr>
-          <w:rFonts w:ascii="Times New Roman" w:eastAsia="Times New Roman" w:hAnsi="Times New Roman" w:cs="Times New Roman"/>
-          <w:bCs/>
-          <w:sz w:val="20"/>
-          <w:szCs w:val="24"/>
-        </w:rPr>
-        <w:t xml:space="preserve"> by the “CCDM Biannaul.py” script</w:t>
-      </w:r>
-    </w:p>
-    <w:p>
-      <w:pPr>
-        <w:pStyle w:val="ListParagraph"/>
-        <w:numPr>
-          <w:ilvl w:val="2"/>
-          <w:numId w:val="3"/>
-        </w:numPr>
-        <w:spacing w:after="0" w:line="240" w:lineRule="auto"/>
-        <w:rPr>
-          <w:rFonts w:ascii="Times New Roman" w:eastAsia="Times New Roman" w:hAnsi="Times New Roman" w:cs="Times New Roman"/>
-          <w:bCs/>
-          <w:sz w:val="20"/>
-          <w:szCs w:val="24"/>
-        </w:rPr>
-      </w:pPr>
-      <w:r>
-        <w:rPr>
-          <w:rFonts w:ascii="Times New Roman" w:eastAsia="Times New Roman" w:hAnsi="Times New Roman" w:cs="Times New Roman"/>
-          <w:bCs/>
-          <w:sz w:val="20"/>
-          <w:szCs w:val="24"/>
-        </w:rPr>
-        <w:t>A</w:t>
-      </w:r>
-      <w:r>
-        <w:rPr>
-          <w:rFonts w:ascii="Times New Roman" w:eastAsia="Times New Roman" w:hAnsi="Times New Roman" w:cs="Times New Roman"/>
-          <w:bCs/>
-          <w:sz w:val="20"/>
-          <w:szCs w:val="24"/>
-        </w:rPr>
-        <w:t>ll</w:t>
-      </w:r>
-      <w:r>
-        <w:rPr>
-          <w:rFonts w:ascii="Times New Roman" w:eastAsia="Times New Roman" w:hAnsi="Times New Roman" w:cs="Times New Roman"/>
-          <w:bCs/>
-          <w:sz w:val="20"/>
-          <w:szCs w:val="24"/>
-        </w:rPr>
-        <w:t xml:space="preserve"> </w:t>
-      </w:r>
-      <w:proofErr w:type="spellStart"/>
-      <w:r>
-        <w:rPr>
-          <w:rFonts w:ascii="Times New Roman" w:eastAsia="Times New Roman" w:hAnsi="Times New Roman" w:cs="Times New Roman"/>
-          <w:bCs/>
-          <w:sz w:val="20"/>
-          <w:szCs w:val="24"/>
-        </w:rPr>
-        <w:t>png</w:t>
-      </w:r>
-      <w:proofErr w:type="spellEnd"/>
-      <w:r>
-        <w:rPr>
-          <w:rFonts w:ascii="Times New Roman" w:eastAsia="Times New Roman" w:hAnsi="Times New Roman" w:cs="Times New Roman"/>
-          <w:bCs/>
-          <w:sz w:val="20"/>
-          <w:szCs w:val="24"/>
-        </w:rPr>
-        <w:t xml:space="preserve"> plots</w:t>
-      </w:r>
-      <w:r>
-        <w:rPr>
-          <w:rFonts w:ascii="Times New Roman" w:eastAsia="Times New Roman" w:hAnsi="Times New Roman" w:cs="Times New Roman"/>
-          <w:bCs/>
-          <w:sz w:val="20"/>
-          <w:szCs w:val="24"/>
-        </w:rPr>
-        <w:t xml:space="preserve"> (65x plots for each MSID of concern)</w:t>
-      </w:r>
-    </w:p>
-    <w:p>
-      <w:pPr>
-        <w:pStyle w:val="ListParagraph"/>
-        <w:numPr>
-          <w:ilvl w:val="2"/>
-          <w:numId w:val="3"/>
-        </w:numPr>
-        <w:spacing w:after="0" w:line="240" w:lineRule="auto"/>
-        <w:rPr>
-          <w:rFonts w:ascii="Times New Roman" w:eastAsia="Times New Roman" w:hAnsi="Times New Roman" w:cs="Times New Roman"/>
-          <w:bCs/>
-          <w:sz w:val="20"/>
-          <w:szCs w:val="24"/>
-        </w:rPr>
-      </w:pPr>
-      <w:r>
-        <w:rPr>
-          <w:rFonts w:ascii="Times New Roman" w:eastAsia="Times New Roman" w:hAnsi="Times New Roman" w:cs="Times New Roman"/>
-          <w:bCs/>
-          <w:sz w:val="20"/>
-          <w:szCs w:val="24"/>
-        </w:rPr>
-        <w:t>SSR html plots (8x if SSR-B was prime and 9x if SSR-A was prime)</w:t>
-      </w:r>
-    </w:p>
-    <w:p>
-      <w:pPr>
-        <w:pStyle w:val="ListParagraph"/>
-        <w:numPr>
-          <w:ilvl w:val="3"/>
-          <w:numId w:val="3"/>
-        </w:numPr>
-        <w:spacing w:after="0" w:line="240" w:lineRule="auto"/>
-        <w:rPr>
-          <w:rFonts w:ascii="Times New Roman" w:eastAsia="Times New Roman" w:hAnsi="Times New Roman" w:cs="Times New Roman"/>
-          <w:bCs/>
-          <w:sz w:val="20"/>
-          <w:szCs w:val="24"/>
-        </w:rPr>
-      </w:pPr>
-      <w:r>
-        <w:rPr>
-          <w:rFonts w:ascii="Times New Roman" w:eastAsia="Times New Roman" w:hAnsi="Times New Roman" w:cs="Times New Roman"/>
-          <w:bCs/>
-          <w:sz w:val="20"/>
-          <w:szCs w:val="24"/>
-        </w:rPr>
-        <w:t>SBE_vs_DBE_by_Date.html</w:t>
-      </w:r>
-    </w:p>
-    <w:p>
-      <w:pPr>
-        <w:pStyle w:val="ListParagraph"/>
-        <w:numPr>
-          <w:ilvl w:val="3"/>
-          <w:numId w:val="3"/>
-        </w:numPr>
-        <w:spacing w:after="0" w:line="240" w:lineRule="auto"/>
-        <w:rPr>
-          <w:rFonts w:ascii="Times New Roman" w:eastAsia="Times New Roman" w:hAnsi="Times New Roman" w:cs="Times New Roman"/>
-          <w:bCs/>
-          <w:sz w:val="20"/>
-          <w:szCs w:val="24"/>
-        </w:rPr>
-      </w:pPr>
-      <w:r>
-        <w:rPr>
-          <w:rFonts w:ascii="Times New Roman" w:eastAsia="Times New Roman" w:hAnsi="Times New Roman" w:cs="Times New Roman"/>
-          <w:bCs/>
-          <w:sz w:val="20"/>
-          <w:szCs w:val="24"/>
-        </w:rPr>
-        <w:t>SBE_vs_DBE_by_Submodule.html</w:t>
-      </w:r>
-    </w:p>
-    <w:p>
-      <w:pPr>
-        <w:pStyle w:val="ListParagraph"/>
-        <w:numPr>
-          <w:ilvl w:val="3"/>
-          <w:numId w:val="3"/>
-        </w:numPr>
-        <w:spacing w:after="0" w:line="240" w:lineRule="auto"/>
-        <w:rPr>
-          <w:rFonts w:ascii="Times New Roman" w:eastAsia="Times New Roman" w:hAnsi="Times New Roman" w:cs="Times New Roman"/>
-          <w:bCs/>
-          <w:sz w:val="20"/>
-          <w:szCs w:val="24"/>
-        </w:rPr>
-      </w:pPr>
-      <w:r>
-        <w:rPr>
-          <w:rFonts w:ascii="Times New Roman" w:eastAsia="Times New Roman" w:hAnsi="Times New Roman" w:cs="Times New Roman"/>
-          <w:bCs/>
-          <w:sz w:val="20"/>
-          <w:szCs w:val="24"/>
-        </w:rPr>
-        <w:t>Quarterly_SSR_A_by_DoY.html</w:t>
-      </w:r>
-    </w:p>
-    <w:p>
-      <w:pPr>
-        <w:pStyle w:val="ListParagraph"/>
-        <w:numPr>
-          <w:ilvl w:val="3"/>
-          <w:numId w:val="3"/>
-        </w:numPr>
-        <w:spacing w:after="0" w:line="240" w:lineRule="auto"/>
-        <w:rPr>
-          <w:rFonts w:ascii="Times New Roman" w:eastAsia="Times New Roman" w:hAnsi="Times New Roman" w:cs="Times New Roman"/>
-          <w:bCs/>
-          <w:sz w:val="20"/>
-          <w:szCs w:val="24"/>
-        </w:rPr>
-      </w:pPr>
-      <w:r>
-        <w:rPr>
-          <w:rFonts w:ascii="Times New Roman" w:eastAsia="Times New Roman" w:hAnsi="Times New Roman" w:cs="Times New Roman"/>
-          <w:bCs/>
-          <w:sz w:val="20"/>
-          <w:szCs w:val="24"/>
-        </w:rPr>
-        <w:t>Quarterly_SSR_A_by_SubMod.html</w:t>
-      </w:r>
-    </w:p>
-    <w:p>
-      <w:pPr>
-        <w:pStyle w:val="ListParagraph"/>
-        <w:numPr>
-          <w:ilvl w:val="3"/>
-          <w:numId w:val="3"/>
-        </w:numPr>
-        <w:spacing w:after="0" w:line="240" w:lineRule="auto"/>
-        <w:rPr>
-          <w:rFonts w:ascii="Times New Roman" w:eastAsia="Times New Roman" w:hAnsi="Times New Roman" w:cs="Times New Roman"/>
-          <w:bCs/>
-          <w:sz w:val="20"/>
-          <w:szCs w:val="24"/>
-        </w:rPr>
-      </w:pPr>
-      <w:r>
-        <w:rPr>
-          <w:rFonts w:ascii="Times New Roman" w:eastAsia="Times New Roman" w:hAnsi="Times New Roman" w:cs="Times New Roman"/>
-          <w:bCs/>
-          <w:sz w:val="20"/>
-          <w:szCs w:val="24"/>
-        </w:rPr>
-        <w:t>Quarterly_SSR_A_Timestrip.html</w:t>
-      </w:r>
-    </w:p>
-    <w:p>
-      <w:pPr>
-        <w:pStyle w:val="ListParagraph"/>
-        <w:numPr>
-          <w:ilvl w:val="3"/>
-          <w:numId w:val="3"/>
-        </w:numPr>
-        <w:spacing w:after="0" w:line="240" w:lineRule="auto"/>
-        <w:rPr>
-          <w:rFonts w:ascii="Times New Roman" w:eastAsia="Times New Roman" w:hAnsi="Times New Roman" w:cs="Times New Roman"/>
-          <w:bCs/>
-          <w:sz w:val="20"/>
-          <w:szCs w:val="24"/>
-        </w:rPr>
-      </w:pPr>
-      <w:r>
-        <w:rPr>
-          <w:rFonts w:ascii="Times New Roman" w:eastAsia="Times New Roman" w:hAnsi="Times New Roman" w:cs="Times New Roman"/>
-          <w:bCs/>
-          <w:sz w:val="20"/>
-          <w:szCs w:val="24"/>
-        </w:rPr>
-        <w:t>Quarterly_SSR_B_by_DoY.html</w:t>
-      </w:r>
-    </w:p>
-    <w:p>
-      <w:pPr>
-        <w:pStyle w:val="ListParagraph"/>
-        <w:numPr>
-          <w:ilvl w:val="3"/>
-          <w:numId w:val="3"/>
-        </w:numPr>
-        <w:spacing w:after="0" w:line="240" w:lineRule="auto"/>
-        <w:rPr>
-          <w:rFonts w:ascii="Times New Roman" w:eastAsia="Times New Roman" w:hAnsi="Times New Roman" w:cs="Times New Roman"/>
-          <w:bCs/>
-          <w:sz w:val="20"/>
-          <w:szCs w:val="24"/>
-        </w:rPr>
-      </w:pPr>
-      <w:r>
-        <w:rPr>
-          <w:rFonts w:ascii="Times New Roman" w:eastAsia="Times New Roman" w:hAnsi="Times New Roman" w:cs="Times New Roman"/>
-          <w:bCs/>
-          <w:sz w:val="20"/>
-          <w:szCs w:val="24"/>
-        </w:rPr>
-        <w:t>Quarterly_SSR_B_by_SubMod.html</w:t>
-      </w:r>
-    </w:p>
-    <w:p>
-      <w:pPr>
-        <w:pStyle w:val="ListParagraph"/>
-        <w:numPr>
-          <w:ilvl w:val="3"/>
-          <w:numId w:val="3"/>
-        </w:numPr>
-        <w:spacing w:after="0" w:line="240" w:lineRule="auto"/>
-        <w:rPr>
-          <w:rFonts w:ascii="Times New Roman" w:eastAsia="Times New Roman" w:hAnsi="Times New Roman" w:cs="Times New Roman"/>
-          <w:bCs/>
-          <w:sz w:val="20"/>
-          <w:szCs w:val="24"/>
-        </w:rPr>
-      </w:pPr>
-      <w:r>
-        <w:rPr>
-          <w:rFonts w:ascii="Times New Roman" w:eastAsia="Times New Roman" w:hAnsi="Times New Roman" w:cs="Times New Roman"/>
-          <w:bCs/>
-          <w:sz w:val="20"/>
-          <w:szCs w:val="24"/>
-        </w:rPr>
-        <w:t>Quarterly_SSR_B_Timestrip.html</w:t>
-      </w:r>
-    </w:p>
-    <w:p>
-      <w:pPr>
-        <w:pStyle w:val="ListParagraph"/>
-        <w:numPr>
-          <w:ilvl w:val="3"/>
-          <w:numId w:val="3"/>
-        </w:numPr>
-        <w:spacing w:after="0" w:line="240" w:lineRule="auto"/>
-        <w:rPr>
-          <w:rFonts w:ascii="Times New Roman" w:eastAsia="Times New Roman" w:hAnsi="Times New Roman" w:cs="Times New Roman"/>
-          <w:bCs/>
-          <w:sz w:val="20"/>
-          <w:szCs w:val="24"/>
-        </w:rPr>
-      </w:pPr>
-      <w:r>
-        <w:rPr>
-          <w:rFonts w:ascii="Times New Roman" w:eastAsia="Times New Roman" w:hAnsi="Times New Roman" w:cs="Times New Roman"/>
-          <w:bCs/>
-          <w:sz w:val="20"/>
-          <w:szCs w:val="24"/>
-        </w:rPr>
-        <w:t>(If SSR-A was prime) Avg_SBE_Submod104.html</w:t>
-      </w:r>
-    </w:p>
-    <w:p>
-      <w:pPr>
-        <w:pStyle w:val="ListParagraph"/>
-        <w:numPr>
-          <w:ilvl w:val="2"/>
-          <w:numId w:val="3"/>
-        </w:numPr>
-        <w:spacing w:after="0" w:line="240" w:lineRule="auto"/>
-        <w:rPr>
-          <w:rFonts w:ascii="Times New Roman" w:eastAsia="Times New Roman" w:hAnsi="Times New Roman" w:cs="Times New Roman"/>
-          <w:bCs/>
-          <w:sz w:val="20"/>
-          <w:szCs w:val="24"/>
-        </w:rPr>
-      </w:pPr>
-      <w:r>
-        <w:rPr>
-          <w:rFonts w:ascii="Times New Roman" w:eastAsia="Times New Roman" w:hAnsi="Times New Roman" w:cs="Times New Roman"/>
-          <w:bCs/>
-          <w:sz w:val="20"/>
-          <w:szCs w:val="24"/>
-        </w:rPr>
-        <w:t>CSV files containing raw data (14x)</w:t>
-      </w:r>
-    </w:p>
-    <w:p>
-      <w:pPr>
-        <w:pStyle w:val="ListParagraph"/>
-        <w:numPr>
-          <w:ilvl w:val="2"/>
-          <w:numId w:val="3"/>
-        </w:numPr>
-        <w:spacing w:after="0" w:line="240" w:lineRule="auto"/>
-        <w:rPr>
-          <w:rFonts w:ascii="Times New Roman" w:eastAsia="Times New Roman" w:hAnsi="Times New Roman" w:cs="Times New Roman"/>
-          <w:bCs/>
-          <w:sz w:val="20"/>
-          <w:szCs w:val="24"/>
-        </w:rPr>
-      </w:pPr>
-      <w:r>
-        <w:rPr>
-          <w:rFonts w:ascii="Times New Roman" w:eastAsia="Times New Roman" w:hAnsi="Times New Roman" w:cs="Times New Roman"/>
-          <w:bCs/>
-          <w:sz w:val="20"/>
-          <w:szCs w:val="24"/>
-        </w:rPr>
-        <w:t>Transmitter vs Baseplate Temp Plot (YYYYb_TX_BPT.html)</w:t>
-      </w:r>
-    </w:p>
-    <w:p>
-      <w:pPr>
-        <w:spacing w:after="0" w:line="240" w:lineRule="auto"/>
-        <w:rPr>
-          <w:rFonts w:ascii="Times New Roman" w:eastAsia="Times New Roman" w:hAnsi="Times New Roman" w:cs="Times New Roman"/>
-          <w:bCs/>
-          <w:sz w:val="20"/>
-          <w:szCs w:val="24"/>
-        </w:rPr>
-      </w:pPr>
-    </w:p>
-    <w:p>
-      <w:pPr>
-        <w:spacing w:after="0" w:line="240" w:lineRule="auto"/>
-        <w:rPr>
-          <w:rFonts w:ascii="Times New Roman" w:eastAsia="Times New Roman" w:hAnsi="Times New Roman" w:cs="Times New Roman"/>
-          <w:bCs/>
-          <w:sz w:val="20"/>
-          <w:szCs w:val="24"/>
-        </w:rPr>
-      </w:pPr>
-    </w:p>
-    <w:p>
-      <w:pPr>
-        <w:pStyle w:val="ListParagraph"/>
-        <w:numPr>
-          <w:ilvl w:val="0"/>
-          <w:numId w:val="3"/>
-        </w:numPr>
-        <w:spacing w:after="0" w:line="240" w:lineRule="auto"/>
-        <w:rPr>
-          <w:rFonts w:ascii="Times New Roman" w:eastAsia="Times New Roman" w:hAnsi="Times New Roman" w:cs="Times New Roman"/>
-          <w:b/>
-          <w:sz w:val="20"/>
-          <w:szCs w:val="24"/>
-        </w:rPr>
-      </w:pPr>
-      <w:r>
-        <w:rPr>
-          <w:rFonts w:ascii="Times New Roman" w:eastAsia="Times New Roman" w:hAnsi="Times New Roman" w:cs="Times New Roman"/>
-          <w:b/>
-          <w:sz w:val="20"/>
-          <w:szCs w:val="24"/>
-        </w:rPr>
-        <w:t>Clock Rate Data into report</w:t>
-      </w:r>
-    </w:p>
-    <w:p>
-      <w:pPr>
-        <w:pStyle w:val="ListParagraph"/>
-        <w:numPr>
-          <w:ilvl w:val="1"/>
-          <w:numId w:val="3"/>
-        </w:numPr>
-        <w:spacing w:after="0" w:line="240" w:lineRule="auto"/>
-        <w:rPr>
-          <w:rFonts w:ascii="Times New Roman" w:eastAsia="Times New Roman" w:hAnsi="Times New Roman" w:cs="Times New Roman"/>
-          <w:bCs/>
-          <w:sz w:val="20"/>
-          <w:szCs w:val="24"/>
-        </w:rPr>
-      </w:pPr>
-      <w:r>
-        <w:rPr>
-          <w:rFonts w:ascii="Times New Roman" w:eastAsia="Times New Roman" w:hAnsi="Times New Roman" w:cs="Times New Roman"/>
-          <w:bCs/>
-          <w:sz w:val="20"/>
-          <w:szCs w:val="24"/>
-        </w:rPr>
-        <w:t xml:space="preserve">From noodle directory </w:t>
-      </w:r>
-      <w:hyperlink r:id="rId11" w:history="1">
         <w:r>
           <w:rPr>
             <w:rStyle w:val="Hyperlink"/>
@@ -2106,7 +2245,7 @@
       </w:pPr>
     </w:p>
     <w:sectPr>
-      <w:headerReference w:type="default" r:id="rId12"/>
+      <w:headerReference w:type="default" r:id="rId11"/>
       <w:pgSz w:w="12240" w:h="15840"/>
       <w:pgMar w:top="1440" w:right="1440" w:bottom="1440" w:left="1440" w:header="720" w:footer="720" w:gutter="0"/>
       <w:cols w:space="720"/>
@@ -2216,7 +2355,23 @@
         <w:szCs w:val="16"/>
         <w:u w:val="none"/>
       </w:rPr>
-      <w:t>(as of 08/2024)</w:t>
+      <w:t>(as of 08/202</w:t>
+    </w:r>
+    <w:r>
+      <w:rPr>
+        <w:sz w:val="16"/>
+        <w:szCs w:val="16"/>
+        <w:u w:val="none"/>
+      </w:rPr>
+      <w:t>5</w:t>
+    </w:r>
+    <w:r>
+      <w:rPr>
+        <w:sz w:val="16"/>
+        <w:szCs w:val="16"/>
+        <w:u w:val="none"/>
+      </w:rPr>
+      <w:t>)</w:t>
     </w:r>
   </w:p>
   <w:p>

</xml_diff>

<commit_message>
Update biannual process to work without kalelido on linux
</commit_message>
<xml_diff>
--- a/Biannual/CCDM Biannaul Instructions.docx
+++ b/Biannual/CCDM Biannaul Instructions.docx
@@ -523,16 +523,7 @@
           <w:sz w:val="20"/>
           <w:szCs w:val="24"/>
         </w:rPr>
-        <w:t xml:space="preserve">From: </w:t>
-      </w:r>
-      <w:r>
-        <w:rPr>
-          <w:rFonts w:ascii="Times New Roman" w:eastAsia="Times New Roman" w:hAnsi="Times New Roman" w:cs="Times New Roman"/>
-          <w:bCs/>
-          <w:sz w:val="20"/>
-          <w:szCs w:val="24"/>
-        </w:rPr>
-        <w:t>\\noodle\FOT\</w:t>
+        <w:t>From: \\noodle\FOT\</w:t>
       </w:r>
       <w:r>
         <w:rPr>
@@ -566,16 +557,7 @@
           <w:sz w:val="20"/>
           <w:szCs w:val="24"/>
         </w:rPr>
-        <w:t xml:space="preserve">To:      </w:t>
-      </w:r>
-      <w:r>
-        <w:rPr>
-          <w:rFonts w:ascii="Times New Roman" w:eastAsia="Times New Roman" w:hAnsi="Times New Roman" w:cs="Times New Roman"/>
-          <w:bCs/>
-          <w:sz w:val="20"/>
-          <w:szCs w:val="24"/>
-        </w:rPr>
-        <w:t>\NM_YYMMM_YYMMM\DSN</w:t>
+        <w:t>To:      \NM_YYMMM_YYMMM\DSN</w:t>
       </w:r>
     </w:p>
     <w:p>
@@ -1295,17 +1277,7 @@
             <w:sz w:val="18"/>
             <w:szCs w:val="18"/>
           </w:rPr>
-          <w:t>\\noodle\GRETA</w:t>
-        </w:r>
-        <w:r>
-          <w:rPr>
-            <w:rStyle w:val="Hyperlink"/>
-            <w:rFonts w:ascii="Times New Roman" w:eastAsia="Times New Roman" w:hAnsi="Times New Roman" w:cs="Times New Roman"/>
-            <w:bCs/>
-            <w:sz w:val="18"/>
-            <w:szCs w:val="18"/>
-          </w:rPr>
-          <w:t>\rhoover\python\Code\dev\ccdm\Biannual\components\average_sbe_submod104_plot.py</w:t>
+          <w:t>\\noodle\GRETA\rhoover\python\Code\dev\ccdm\Biannual\components\average_sbe_submod104_plot.py</w:t>
         </w:r>
       </w:hyperlink>
     </w:p>
@@ -1328,6 +1300,7 @@
         <w:rPr>
           <w:rFonts w:ascii="Times New Roman" w:eastAsia="Times New Roman" w:hAnsi="Times New Roman" w:cs="Times New Roman"/>
           <w:b/>
+          <w:noProof/>
           <w:sz w:val="18"/>
           <w:szCs w:val="18"/>
         </w:rPr>
@@ -1390,25 +1363,7 @@
           <w:sz w:val="18"/>
           <w:szCs w:val="18"/>
         </w:rPr>
-        <w:t>File is in GitHub Repo (</w:t>
-      </w:r>
-      <w:r>
-        <w:rPr>
-          <w:rFonts w:ascii="Times New Roman" w:eastAsia="Times New Roman" w:hAnsi="Times New Roman" w:cs="Times New Roman"/>
-          <w:bCs/>
-          <w:sz w:val="18"/>
-          <w:szCs w:val="18"/>
-        </w:rPr>
-        <w:t>https://github.com/fot/ccdm/blob/main/Biannual/components/average_sbe_submod104_plot.py</w:t>
-      </w:r>
-      <w:r>
-        <w:rPr>
-          <w:rFonts w:ascii="Times New Roman" w:eastAsia="Times New Roman" w:hAnsi="Times New Roman" w:cs="Times New Roman"/>
-          <w:bCs/>
-          <w:sz w:val="18"/>
-          <w:szCs w:val="18"/>
-        </w:rPr>
-        <w:t>)</w:t>
+        <w:t>File is in GitHub Repo (https://github.com/fot/ccdm/blob/main/Biannual/components/average_sbe_submod104_plot.py)</w:t>
       </w:r>
     </w:p>
     <w:p>
@@ -1880,7 +1835,25 @@
           <w:sz w:val="20"/>
           <w:szCs w:val="24"/>
         </w:rPr>
-        <w:t>ython “CCDM Biannual.py"</w:t>
+        <w:t>ython “</w:t>
+      </w:r>
+      <w:r>
+        <w:rPr>
+          <w:rFonts w:ascii="Times New Roman" w:eastAsia="Times New Roman" w:hAnsi="Times New Roman" w:cs="Times New Roman"/>
+          <w:b/>
+          <w:sz w:val="20"/>
+          <w:szCs w:val="24"/>
+        </w:rPr>
+        <w:t>ccdm_biannual.py</w:t>
+      </w:r>
+      <w:r>
+        <w:rPr>
+          <w:rFonts w:ascii="Times New Roman" w:eastAsia="Times New Roman" w:hAnsi="Times New Roman" w:cs="Times New Roman"/>
+          <w:b/>
+          <w:sz w:val="20"/>
+          <w:szCs w:val="24"/>
+        </w:rPr>
+        <w:t>"</w:t>
       </w:r>
     </w:p>
     <w:p>
@@ -2006,19 +1979,19 @@
         <w:spacing w:after="0" w:line="240" w:lineRule="auto"/>
         <w:rPr>
           <w:rFonts w:ascii="Times New Roman" w:eastAsia="Times New Roman" w:hAnsi="Times New Roman" w:cs="Times New Roman"/>
+          <w:bCs/>
+          <w:sz w:val="20"/>
+          <w:szCs w:val="24"/>
+        </w:rPr>
+      </w:pPr>
+      <w:r>
+        <w:rPr>
+          <w:rFonts w:ascii="Times New Roman" w:eastAsia="Times New Roman" w:hAnsi="Times New Roman" w:cs="Times New Roman"/>
           <w:b/>
           <w:sz w:val="20"/>
           <w:szCs w:val="24"/>
         </w:rPr>
-      </w:pPr>
-      <w:r>
-        <w:rPr>
-          <w:rFonts w:ascii="Times New Roman" w:eastAsia="Times New Roman" w:hAnsi="Times New Roman" w:cs="Times New Roman"/>
-          <w:b/>
-          <w:sz w:val="20"/>
-          <w:szCs w:val="24"/>
-        </w:rPr>
-        <w:t>Compile auto-generated items into report.</w:t>
+        <w:t>Convert all JSON plot files to PNG files</w:t>
       </w:r>
     </w:p>
     <w:p>
@@ -2043,7 +2016,7 @@
           <w:sz w:val="20"/>
           <w:szCs w:val="24"/>
         </w:rPr>
-        <w:t>The following items will be auto-</w:t>
+        <w:t xml:space="preserve">Run GUI tool </w:t>
       </w:r>
       <w:proofErr w:type="spellStart"/>
       <w:r>
@@ -2053,17 +2026,33 @@
           <w:sz w:val="20"/>
           <w:szCs w:val="24"/>
         </w:rPr>
-        <w:t>gen’ed</w:t>
+        <w:t>json_to_png_converter.pyw</w:t>
       </w:r>
       <w:proofErr w:type="spellEnd"/>
-      <w:r>
-        <w:rPr>
-          <w:rFonts w:ascii="Times New Roman" w:eastAsia="Times New Roman" w:hAnsi="Times New Roman" w:cs="Times New Roman"/>
-          <w:bCs/>
-          <w:sz w:val="20"/>
-          <w:szCs w:val="24"/>
-        </w:rPr>
-        <w:t xml:space="preserve"> by the “CCDM Biannaul.py” script</w:t>
+    </w:p>
+    <w:p>
+      <w:pPr>
+        <w:pStyle w:val="ListParagraph"/>
+        <w:numPr>
+          <w:ilvl w:val="1"/>
+          <w:numId w:val="3"/>
+        </w:numPr>
+        <w:spacing w:after="0" w:line="240" w:lineRule="auto"/>
+        <w:rPr>
+          <w:rFonts w:ascii="Times New Roman" w:eastAsia="Times New Roman" w:hAnsi="Times New Roman" w:cs="Times New Roman"/>
+          <w:bCs/>
+          <w:sz w:val="20"/>
+          <w:szCs w:val="24"/>
+        </w:rPr>
+      </w:pPr>
+      <w:r>
+        <w:rPr>
+          <w:rFonts w:ascii="Times New Roman" w:eastAsia="Times New Roman" w:hAnsi="Times New Roman" w:cs="Times New Roman"/>
+          <w:bCs/>
+          <w:sz w:val="20"/>
+          <w:szCs w:val="24"/>
+        </w:rPr>
+        <w:t>Input all generated .json files from run of ccdm_biannual.py</w:t>
       </w:r>
     </w:p>
     <w:p>
@@ -2088,16 +2077,7 @@
           <w:sz w:val="20"/>
           <w:szCs w:val="24"/>
         </w:rPr>
-        <w:t>A</w:t>
-      </w:r>
-      <w:r>
-        <w:rPr>
-          <w:rFonts w:ascii="Times New Roman" w:eastAsia="Times New Roman" w:hAnsi="Times New Roman" w:cs="Times New Roman"/>
-          <w:bCs/>
-          <w:sz w:val="20"/>
-          <w:szCs w:val="24"/>
-        </w:rPr>
-        <w:t>ll</w:t>
+        <w:t>All json</w:t>
       </w:r>
       <w:r>
         <w:rPr>
@@ -2108,6 +2088,56 @@
         </w:rPr>
         <w:t xml:space="preserve"> </w:t>
       </w:r>
+      <w:r>
+        <w:rPr>
+          <w:rFonts w:ascii="Times New Roman" w:eastAsia="Times New Roman" w:hAnsi="Times New Roman" w:cs="Times New Roman"/>
+          <w:bCs/>
+          <w:sz w:val="20"/>
+          <w:szCs w:val="24"/>
+        </w:rPr>
+        <w:t>plots (65x plots for each MSID of concern)</w:t>
+      </w:r>
+    </w:p>
+    <w:p>
+      <w:pPr>
+        <w:pStyle w:val="ListParagraph"/>
+        <w:numPr>
+          <w:ilvl w:val="2"/>
+          <w:numId w:val="3"/>
+        </w:numPr>
+        <w:spacing w:after="0" w:line="240" w:lineRule="auto"/>
+        <w:rPr>
+          <w:rFonts w:ascii="Times New Roman" w:eastAsia="Times New Roman" w:hAnsi="Times New Roman" w:cs="Times New Roman"/>
+          <w:bCs/>
+          <w:sz w:val="20"/>
+          <w:szCs w:val="24"/>
+        </w:rPr>
+      </w:pPr>
+      <w:r>
+        <w:rPr>
+          <w:rFonts w:ascii="Times New Roman" w:eastAsia="Times New Roman" w:hAnsi="Times New Roman" w:cs="Times New Roman"/>
+          <w:bCs/>
+          <w:sz w:val="20"/>
+          <w:szCs w:val="24"/>
+        </w:rPr>
+        <w:t>SSR html plots (8x if SSR-B was prime and 9x if SSR-A was prime)</w:t>
+      </w:r>
+    </w:p>
+    <w:p>
+      <w:pPr>
+        <w:pStyle w:val="ListParagraph"/>
+        <w:numPr>
+          <w:ilvl w:val="3"/>
+          <w:numId w:val="3"/>
+        </w:numPr>
+        <w:spacing w:after="0" w:line="240" w:lineRule="auto"/>
+        <w:rPr>
+          <w:rFonts w:ascii="Times New Roman" w:eastAsia="Times New Roman" w:hAnsi="Times New Roman" w:cs="Times New Roman"/>
+          <w:bCs/>
+          <w:sz w:val="20"/>
+          <w:szCs w:val="24"/>
+        </w:rPr>
+      </w:pPr>
       <w:proofErr w:type="spellStart"/>
       <w:r>
         <w:rPr>
@@ -2116,26 +2146,384 @@
           <w:sz w:val="20"/>
           <w:szCs w:val="24"/>
         </w:rPr>
-        <w:t>png</w:t>
+        <w:t>SBE_vs_DBE_by_Date.</w:t>
+      </w:r>
+      <w:r>
+        <w:rPr>
+          <w:rFonts w:ascii="Times New Roman" w:eastAsia="Times New Roman" w:hAnsi="Times New Roman" w:cs="Times New Roman"/>
+          <w:bCs/>
+          <w:sz w:val="20"/>
+          <w:szCs w:val="24"/>
+        </w:rPr>
+        <w:t>json</w:t>
       </w:r>
       <w:proofErr w:type="spellEnd"/>
-      <w:r>
-        <w:rPr>
-          <w:rFonts w:ascii="Times New Roman" w:eastAsia="Times New Roman" w:hAnsi="Times New Roman" w:cs="Times New Roman"/>
-          <w:bCs/>
-          <w:sz w:val="20"/>
-          <w:szCs w:val="24"/>
-        </w:rPr>
-        <w:t xml:space="preserve"> plots</w:t>
-      </w:r>
-      <w:r>
-        <w:rPr>
-          <w:rFonts w:ascii="Times New Roman" w:eastAsia="Times New Roman" w:hAnsi="Times New Roman" w:cs="Times New Roman"/>
-          <w:bCs/>
-          <w:sz w:val="20"/>
-          <w:szCs w:val="24"/>
-        </w:rPr>
-        <w:t xml:space="preserve"> (65x plots for each MSID of concern)</w:t>
+    </w:p>
+    <w:p>
+      <w:pPr>
+        <w:pStyle w:val="ListParagraph"/>
+        <w:numPr>
+          <w:ilvl w:val="3"/>
+          <w:numId w:val="3"/>
+        </w:numPr>
+        <w:spacing w:after="0" w:line="240" w:lineRule="auto"/>
+        <w:rPr>
+          <w:rFonts w:ascii="Times New Roman" w:eastAsia="Times New Roman" w:hAnsi="Times New Roman" w:cs="Times New Roman"/>
+          <w:bCs/>
+          <w:sz w:val="20"/>
+          <w:szCs w:val="24"/>
+        </w:rPr>
+      </w:pPr>
+      <w:proofErr w:type="spellStart"/>
+      <w:r>
+        <w:rPr>
+          <w:rFonts w:ascii="Times New Roman" w:eastAsia="Times New Roman" w:hAnsi="Times New Roman" w:cs="Times New Roman"/>
+          <w:bCs/>
+          <w:sz w:val="20"/>
+          <w:szCs w:val="24"/>
+        </w:rPr>
+        <w:t>SBE_vs_DBE_by_Submodule.</w:t>
+      </w:r>
+      <w:r>
+        <w:rPr>
+          <w:rFonts w:ascii="Times New Roman" w:eastAsia="Times New Roman" w:hAnsi="Times New Roman" w:cs="Times New Roman"/>
+          <w:bCs/>
+          <w:sz w:val="20"/>
+          <w:szCs w:val="24"/>
+        </w:rPr>
+        <w:t>json</w:t>
+      </w:r>
+      <w:proofErr w:type="spellEnd"/>
+    </w:p>
+    <w:p>
+      <w:pPr>
+        <w:pStyle w:val="ListParagraph"/>
+        <w:numPr>
+          <w:ilvl w:val="3"/>
+          <w:numId w:val="3"/>
+        </w:numPr>
+        <w:spacing w:after="0" w:line="240" w:lineRule="auto"/>
+        <w:rPr>
+          <w:rFonts w:ascii="Times New Roman" w:eastAsia="Times New Roman" w:hAnsi="Times New Roman" w:cs="Times New Roman"/>
+          <w:bCs/>
+          <w:sz w:val="20"/>
+          <w:szCs w:val="24"/>
+        </w:rPr>
+      </w:pPr>
+      <w:proofErr w:type="spellStart"/>
+      <w:r>
+        <w:rPr>
+          <w:rFonts w:ascii="Times New Roman" w:eastAsia="Times New Roman" w:hAnsi="Times New Roman" w:cs="Times New Roman"/>
+          <w:bCs/>
+          <w:sz w:val="20"/>
+          <w:szCs w:val="24"/>
+        </w:rPr>
+        <w:t>Quarterly_SSR_A_by_DoY.</w:t>
+      </w:r>
+      <w:r>
+        <w:rPr>
+          <w:rFonts w:ascii="Times New Roman" w:eastAsia="Times New Roman" w:hAnsi="Times New Roman" w:cs="Times New Roman"/>
+          <w:bCs/>
+          <w:sz w:val="20"/>
+          <w:szCs w:val="24"/>
+        </w:rPr>
+        <w:t>json</w:t>
+      </w:r>
+      <w:proofErr w:type="spellEnd"/>
+    </w:p>
+    <w:p>
+      <w:pPr>
+        <w:pStyle w:val="ListParagraph"/>
+        <w:numPr>
+          <w:ilvl w:val="3"/>
+          <w:numId w:val="3"/>
+        </w:numPr>
+        <w:spacing w:after="0" w:line="240" w:lineRule="auto"/>
+        <w:rPr>
+          <w:rFonts w:ascii="Times New Roman" w:eastAsia="Times New Roman" w:hAnsi="Times New Roman" w:cs="Times New Roman"/>
+          <w:bCs/>
+          <w:sz w:val="20"/>
+          <w:szCs w:val="24"/>
+        </w:rPr>
+      </w:pPr>
+      <w:proofErr w:type="spellStart"/>
+      <w:r>
+        <w:rPr>
+          <w:rFonts w:ascii="Times New Roman" w:eastAsia="Times New Roman" w:hAnsi="Times New Roman" w:cs="Times New Roman"/>
+          <w:bCs/>
+          <w:sz w:val="20"/>
+          <w:szCs w:val="24"/>
+        </w:rPr>
+        <w:t>Quarterly_SSR_A_by_SubMod.</w:t>
+      </w:r>
+      <w:r>
+        <w:rPr>
+          <w:rFonts w:ascii="Times New Roman" w:eastAsia="Times New Roman" w:hAnsi="Times New Roman" w:cs="Times New Roman"/>
+          <w:bCs/>
+          <w:sz w:val="20"/>
+          <w:szCs w:val="24"/>
+        </w:rPr>
+        <w:t>json</w:t>
+      </w:r>
+      <w:proofErr w:type="spellEnd"/>
+    </w:p>
+    <w:p>
+      <w:pPr>
+        <w:pStyle w:val="ListParagraph"/>
+        <w:numPr>
+          <w:ilvl w:val="3"/>
+          <w:numId w:val="3"/>
+        </w:numPr>
+        <w:spacing w:after="0" w:line="240" w:lineRule="auto"/>
+        <w:rPr>
+          <w:rFonts w:ascii="Times New Roman" w:eastAsia="Times New Roman" w:hAnsi="Times New Roman" w:cs="Times New Roman"/>
+          <w:bCs/>
+          <w:sz w:val="20"/>
+          <w:szCs w:val="24"/>
+        </w:rPr>
+      </w:pPr>
+      <w:proofErr w:type="spellStart"/>
+      <w:r>
+        <w:rPr>
+          <w:rFonts w:ascii="Times New Roman" w:eastAsia="Times New Roman" w:hAnsi="Times New Roman" w:cs="Times New Roman"/>
+          <w:bCs/>
+          <w:sz w:val="20"/>
+          <w:szCs w:val="24"/>
+        </w:rPr>
+        <w:t>Quarterly_SSR_A_Timestrip</w:t>
+      </w:r>
+      <w:proofErr w:type="spellEnd"/>
+      <w:r>
+        <w:rPr>
+          <w:rFonts w:ascii="Times New Roman" w:eastAsia="Times New Roman" w:hAnsi="Times New Roman" w:cs="Times New Roman"/>
+          <w:bCs/>
+          <w:sz w:val="20"/>
+          <w:szCs w:val="24"/>
+        </w:rPr>
+        <w:t>.</w:t>
+      </w:r>
+      <w:r>
+        <w:rPr>
+          <w:rFonts w:ascii="Times New Roman" w:eastAsia="Times New Roman" w:hAnsi="Times New Roman" w:cs="Times New Roman"/>
+          <w:bCs/>
+          <w:sz w:val="20"/>
+          <w:szCs w:val="24"/>
+        </w:rPr>
+        <w:t xml:space="preserve"> </w:t>
+      </w:r>
+      <w:r>
+        <w:rPr>
+          <w:rFonts w:ascii="Times New Roman" w:eastAsia="Times New Roman" w:hAnsi="Times New Roman" w:cs="Times New Roman"/>
+          <w:bCs/>
+          <w:sz w:val="20"/>
+          <w:szCs w:val="24"/>
+        </w:rPr>
+        <w:t>json</w:t>
+      </w:r>
+    </w:p>
+    <w:p>
+      <w:pPr>
+        <w:pStyle w:val="ListParagraph"/>
+        <w:numPr>
+          <w:ilvl w:val="3"/>
+          <w:numId w:val="3"/>
+        </w:numPr>
+        <w:spacing w:after="0" w:line="240" w:lineRule="auto"/>
+        <w:rPr>
+          <w:rFonts w:ascii="Times New Roman" w:eastAsia="Times New Roman" w:hAnsi="Times New Roman" w:cs="Times New Roman"/>
+          <w:bCs/>
+          <w:sz w:val="20"/>
+          <w:szCs w:val="24"/>
+        </w:rPr>
+      </w:pPr>
+      <w:proofErr w:type="spellStart"/>
+      <w:r>
+        <w:rPr>
+          <w:rFonts w:ascii="Times New Roman" w:eastAsia="Times New Roman" w:hAnsi="Times New Roman" w:cs="Times New Roman"/>
+          <w:bCs/>
+          <w:sz w:val="20"/>
+          <w:szCs w:val="24"/>
+        </w:rPr>
+        <w:t>Quarterly_SSR_B_by_DoY</w:t>
+      </w:r>
+      <w:proofErr w:type="spellEnd"/>
+      <w:r>
+        <w:rPr>
+          <w:rFonts w:ascii="Times New Roman" w:eastAsia="Times New Roman" w:hAnsi="Times New Roman" w:cs="Times New Roman"/>
+          <w:bCs/>
+          <w:sz w:val="20"/>
+          <w:szCs w:val="24"/>
+        </w:rPr>
+        <w:t>.</w:t>
+      </w:r>
+      <w:r>
+        <w:rPr>
+          <w:rFonts w:ascii="Times New Roman" w:eastAsia="Times New Roman" w:hAnsi="Times New Roman" w:cs="Times New Roman"/>
+          <w:bCs/>
+          <w:sz w:val="20"/>
+          <w:szCs w:val="24"/>
+        </w:rPr>
+        <w:t xml:space="preserve"> </w:t>
+      </w:r>
+      <w:r>
+        <w:rPr>
+          <w:rFonts w:ascii="Times New Roman" w:eastAsia="Times New Roman" w:hAnsi="Times New Roman" w:cs="Times New Roman"/>
+          <w:bCs/>
+          <w:sz w:val="20"/>
+          <w:szCs w:val="24"/>
+        </w:rPr>
+        <w:t>json</w:t>
+      </w:r>
+    </w:p>
+    <w:p>
+      <w:pPr>
+        <w:pStyle w:val="ListParagraph"/>
+        <w:numPr>
+          <w:ilvl w:val="3"/>
+          <w:numId w:val="3"/>
+        </w:numPr>
+        <w:spacing w:after="0" w:line="240" w:lineRule="auto"/>
+        <w:rPr>
+          <w:rFonts w:ascii="Times New Roman" w:eastAsia="Times New Roman" w:hAnsi="Times New Roman" w:cs="Times New Roman"/>
+          <w:bCs/>
+          <w:sz w:val="20"/>
+          <w:szCs w:val="24"/>
+        </w:rPr>
+      </w:pPr>
+      <w:proofErr w:type="spellStart"/>
+      <w:r>
+        <w:rPr>
+          <w:rFonts w:ascii="Times New Roman" w:eastAsia="Times New Roman" w:hAnsi="Times New Roman" w:cs="Times New Roman"/>
+          <w:bCs/>
+          <w:sz w:val="20"/>
+          <w:szCs w:val="24"/>
+        </w:rPr>
+        <w:t>Quarterly_SSR_B_by_SubMod</w:t>
+      </w:r>
+      <w:proofErr w:type="spellEnd"/>
+      <w:r>
+        <w:rPr>
+          <w:rFonts w:ascii="Times New Roman" w:eastAsia="Times New Roman" w:hAnsi="Times New Roman" w:cs="Times New Roman"/>
+          <w:bCs/>
+          <w:sz w:val="20"/>
+          <w:szCs w:val="24"/>
+        </w:rPr>
+        <w:t>.</w:t>
+      </w:r>
+      <w:r>
+        <w:rPr>
+          <w:rFonts w:ascii="Times New Roman" w:eastAsia="Times New Roman" w:hAnsi="Times New Roman" w:cs="Times New Roman"/>
+          <w:bCs/>
+          <w:sz w:val="20"/>
+          <w:szCs w:val="24"/>
+        </w:rPr>
+        <w:t xml:space="preserve"> </w:t>
+      </w:r>
+      <w:r>
+        <w:rPr>
+          <w:rFonts w:ascii="Times New Roman" w:eastAsia="Times New Roman" w:hAnsi="Times New Roman" w:cs="Times New Roman"/>
+          <w:bCs/>
+          <w:sz w:val="20"/>
+          <w:szCs w:val="24"/>
+        </w:rPr>
+        <w:t>json</w:t>
+      </w:r>
+    </w:p>
+    <w:p>
+      <w:pPr>
+        <w:pStyle w:val="ListParagraph"/>
+        <w:numPr>
+          <w:ilvl w:val="3"/>
+          <w:numId w:val="3"/>
+        </w:numPr>
+        <w:spacing w:after="0" w:line="240" w:lineRule="auto"/>
+        <w:rPr>
+          <w:rFonts w:ascii="Times New Roman" w:eastAsia="Times New Roman" w:hAnsi="Times New Roman" w:cs="Times New Roman"/>
+          <w:bCs/>
+          <w:sz w:val="20"/>
+          <w:szCs w:val="24"/>
+        </w:rPr>
+      </w:pPr>
+      <w:proofErr w:type="spellStart"/>
+      <w:r>
+        <w:rPr>
+          <w:rFonts w:ascii="Times New Roman" w:eastAsia="Times New Roman" w:hAnsi="Times New Roman" w:cs="Times New Roman"/>
+          <w:bCs/>
+          <w:sz w:val="20"/>
+          <w:szCs w:val="24"/>
+        </w:rPr>
+        <w:t>Quarterly_SSR_B_Timestrip</w:t>
+      </w:r>
+      <w:proofErr w:type="spellEnd"/>
+      <w:r>
+        <w:rPr>
+          <w:rFonts w:ascii="Times New Roman" w:eastAsia="Times New Roman" w:hAnsi="Times New Roman" w:cs="Times New Roman"/>
+          <w:bCs/>
+          <w:sz w:val="20"/>
+          <w:szCs w:val="24"/>
+        </w:rPr>
+        <w:t>.</w:t>
+      </w:r>
+      <w:r>
+        <w:rPr>
+          <w:rFonts w:ascii="Times New Roman" w:eastAsia="Times New Roman" w:hAnsi="Times New Roman" w:cs="Times New Roman"/>
+          <w:bCs/>
+          <w:sz w:val="20"/>
+          <w:szCs w:val="24"/>
+        </w:rPr>
+        <w:t xml:space="preserve"> </w:t>
+      </w:r>
+      <w:r>
+        <w:rPr>
+          <w:rFonts w:ascii="Times New Roman" w:eastAsia="Times New Roman" w:hAnsi="Times New Roman" w:cs="Times New Roman"/>
+          <w:bCs/>
+          <w:sz w:val="20"/>
+          <w:szCs w:val="24"/>
+        </w:rPr>
+        <w:t>json</w:t>
+      </w:r>
+    </w:p>
+    <w:p>
+      <w:pPr>
+        <w:pStyle w:val="ListParagraph"/>
+        <w:numPr>
+          <w:ilvl w:val="3"/>
+          <w:numId w:val="3"/>
+        </w:numPr>
+        <w:spacing w:after="0" w:line="240" w:lineRule="auto"/>
+        <w:rPr>
+          <w:rFonts w:ascii="Times New Roman" w:eastAsia="Times New Roman" w:hAnsi="Times New Roman" w:cs="Times New Roman"/>
+          <w:bCs/>
+          <w:sz w:val="20"/>
+          <w:szCs w:val="24"/>
+        </w:rPr>
+      </w:pPr>
+      <w:r>
+        <w:rPr>
+          <w:rFonts w:ascii="Times New Roman" w:eastAsia="Times New Roman" w:hAnsi="Times New Roman" w:cs="Times New Roman"/>
+          <w:bCs/>
+          <w:sz w:val="20"/>
+          <w:szCs w:val="24"/>
+        </w:rPr>
+        <w:t>(If SSR-A was prime) Avg_SBE_Submod104.</w:t>
+      </w:r>
+      <w:r>
+        <w:rPr>
+          <w:rFonts w:ascii="Times New Roman" w:eastAsia="Times New Roman" w:hAnsi="Times New Roman" w:cs="Times New Roman"/>
+          <w:bCs/>
+          <w:sz w:val="20"/>
+          <w:szCs w:val="24"/>
+        </w:rPr>
+        <w:t xml:space="preserve"> </w:t>
+      </w:r>
+      <w:r>
+        <w:rPr>
+          <w:rFonts w:ascii="Times New Roman" w:eastAsia="Times New Roman" w:hAnsi="Times New Roman" w:cs="Times New Roman"/>
+          <w:bCs/>
+          <w:sz w:val="20"/>
+          <w:szCs w:val="24"/>
+        </w:rPr>
+        <w:t>json</w:t>
       </w:r>
     </w:p>
     <w:p>
@@ -2160,232 +2548,7 @@
           <w:sz w:val="20"/>
           <w:szCs w:val="24"/>
         </w:rPr>
-        <w:t>SSR html plots (8x if SSR-B was prime and 9x if SSR-A was prime)</w:t>
-      </w:r>
-    </w:p>
-    <w:p>
-      <w:pPr>
-        <w:pStyle w:val="ListParagraph"/>
-        <w:numPr>
-          <w:ilvl w:val="3"/>
-          <w:numId w:val="3"/>
-        </w:numPr>
-        <w:spacing w:after="0" w:line="240" w:lineRule="auto"/>
-        <w:rPr>
-          <w:rFonts w:ascii="Times New Roman" w:eastAsia="Times New Roman" w:hAnsi="Times New Roman" w:cs="Times New Roman"/>
-          <w:bCs/>
-          <w:sz w:val="20"/>
-          <w:szCs w:val="24"/>
-        </w:rPr>
-      </w:pPr>
-      <w:r>
-        <w:rPr>
-          <w:rFonts w:ascii="Times New Roman" w:eastAsia="Times New Roman" w:hAnsi="Times New Roman" w:cs="Times New Roman"/>
-          <w:bCs/>
-          <w:sz w:val="20"/>
-          <w:szCs w:val="24"/>
-        </w:rPr>
-        <w:t>SBE_vs_DBE_by_Date.html</w:t>
-      </w:r>
-    </w:p>
-    <w:p>
-      <w:pPr>
-        <w:pStyle w:val="ListParagraph"/>
-        <w:numPr>
-          <w:ilvl w:val="3"/>
-          <w:numId w:val="3"/>
-        </w:numPr>
-        <w:spacing w:after="0" w:line="240" w:lineRule="auto"/>
-        <w:rPr>
-          <w:rFonts w:ascii="Times New Roman" w:eastAsia="Times New Roman" w:hAnsi="Times New Roman" w:cs="Times New Roman"/>
-          <w:bCs/>
-          <w:sz w:val="20"/>
-          <w:szCs w:val="24"/>
-        </w:rPr>
-      </w:pPr>
-      <w:r>
-        <w:rPr>
-          <w:rFonts w:ascii="Times New Roman" w:eastAsia="Times New Roman" w:hAnsi="Times New Roman" w:cs="Times New Roman"/>
-          <w:bCs/>
-          <w:sz w:val="20"/>
-          <w:szCs w:val="24"/>
-        </w:rPr>
-        <w:t>SBE_vs_DBE_by_Submodule.html</w:t>
-      </w:r>
-    </w:p>
-    <w:p>
-      <w:pPr>
-        <w:pStyle w:val="ListParagraph"/>
-        <w:numPr>
-          <w:ilvl w:val="3"/>
-          <w:numId w:val="3"/>
-        </w:numPr>
-        <w:spacing w:after="0" w:line="240" w:lineRule="auto"/>
-        <w:rPr>
-          <w:rFonts w:ascii="Times New Roman" w:eastAsia="Times New Roman" w:hAnsi="Times New Roman" w:cs="Times New Roman"/>
-          <w:bCs/>
-          <w:sz w:val="20"/>
-          <w:szCs w:val="24"/>
-        </w:rPr>
-      </w:pPr>
-      <w:r>
-        <w:rPr>
-          <w:rFonts w:ascii="Times New Roman" w:eastAsia="Times New Roman" w:hAnsi="Times New Roman" w:cs="Times New Roman"/>
-          <w:bCs/>
-          <w:sz w:val="20"/>
-          <w:szCs w:val="24"/>
-        </w:rPr>
-        <w:t>Quarterly_SSR_A_by_DoY.html</w:t>
-      </w:r>
-    </w:p>
-    <w:p>
-      <w:pPr>
-        <w:pStyle w:val="ListParagraph"/>
-        <w:numPr>
-          <w:ilvl w:val="3"/>
-          <w:numId w:val="3"/>
-        </w:numPr>
-        <w:spacing w:after="0" w:line="240" w:lineRule="auto"/>
-        <w:rPr>
-          <w:rFonts w:ascii="Times New Roman" w:eastAsia="Times New Roman" w:hAnsi="Times New Roman" w:cs="Times New Roman"/>
-          <w:bCs/>
-          <w:sz w:val="20"/>
-          <w:szCs w:val="24"/>
-        </w:rPr>
-      </w:pPr>
-      <w:r>
-        <w:rPr>
-          <w:rFonts w:ascii="Times New Roman" w:eastAsia="Times New Roman" w:hAnsi="Times New Roman" w:cs="Times New Roman"/>
-          <w:bCs/>
-          <w:sz w:val="20"/>
-          <w:szCs w:val="24"/>
-        </w:rPr>
-        <w:t>Quarterly_SSR_A_by_SubMod.html</w:t>
-      </w:r>
-    </w:p>
-    <w:p>
-      <w:pPr>
-        <w:pStyle w:val="ListParagraph"/>
-        <w:numPr>
-          <w:ilvl w:val="3"/>
-          <w:numId w:val="3"/>
-        </w:numPr>
-        <w:spacing w:after="0" w:line="240" w:lineRule="auto"/>
-        <w:rPr>
-          <w:rFonts w:ascii="Times New Roman" w:eastAsia="Times New Roman" w:hAnsi="Times New Roman" w:cs="Times New Roman"/>
-          <w:bCs/>
-          <w:sz w:val="20"/>
-          <w:szCs w:val="24"/>
-        </w:rPr>
-      </w:pPr>
-      <w:r>
-        <w:rPr>
-          <w:rFonts w:ascii="Times New Roman" w:eastAsia="Times New Roman" w:hAnsi="Times New Roman" w:cs="Times New Roman"/>
-          <w:bCs/>
-          <w:sz w:val="20"/>
-          <w:szCs w:val="24"/>
-        </w:rPr>
-        <w:t>Quarterly_SSR_A_Timestrip.html</w:t>
-      </w:r>
-    </w:p>
-    <w:p>
-      <w:pPr>
-        <w:pStyle w:val="ListParagraph"/>
-        <w:numPr>
-          <w:ilvl w:val="3"/>
-          <w:numId w:val="3"/>
-        </w:numPr>
-        <w:spacing w:after="0" w:line="240" w:lineRule="auto"/>
-        <w:rPr>
-          <w:rFonts w:ascii="Times New Roman" w:eastAsia="Times New Roman" w:hAnsi="Times New Roman" w:cs="Times New Roman"/>
-          <w:bCs/>
-          <w:sz w:val="20"/>
-          <w:szCs w:val="24"/>
-        </w:rPr>
-      </w:pPr>
-      <w:r>
-        <w:rPr>
-          <w:rFonts w:ascii="Times New Roman" w:eastAsia="Times New Roman" w:hAnsi="Times New Roman" w:cs="Times New Roman"/>
-          <w:bCs/>
-          <w:sz w:val="20"/>
-          <w:szCs w:val="24"/>
-        </w:rPr>
-        <w:t>Quarterly_SSR_B_by_DoY.html</w:t>
-      </w:r>
-    </w:p>
-    <w:p>
-      <w:pPr>
-        <w:pStyle w:val="ListParagraph"/>
-        <w:numPr>
-          <w:ilvl w:val="3"/>
-          <w:numId w:val="3"/>
-        </w:numPr>
-        <w:spacing w:after="0" w:line="240" w:lineRule="auto"/>
-        <w:rPr>
-          <w:rFonts w:ascii="Times New Roman" w:eastAsia="Times New Roman" w:hAnsi="Times New Roman" w:cs="Times New Roman"/>
-          <w:bCs/>
-          <w:sz w:val="20"/>
-          <w:szCs w:val="24"/>
-        </w:rPr>
-      </w:pPr>
-      <w:r>
-        <w:rPr>
-          <w:rFonts w:ascii="Times New Roman" w:eastAsia="Times New Roman" w:hAnsi="Times New Roman" w:cs="Times New Roman"/>
-          <w:bCs/>
-          <w:sz w:val="20"/>
-          <w:szCs w:val="24"/>
-        </w:rPr>
-        <w:t>Quarterly_SSR_B_by_SubMod.html</w:t>
-      </w:r>
-    </w:p>
-    <w:p>
-      <w:pPr>
-        <w:pStyle w:val="ListParagraph"/>
-        <w:numPr>
-          <w:ilvl w:val="3"/>
-          <w:numId w:val="3"/>
-        </w:numPr>
-        <w:spacing w:after="0" w:line="240" w:lineRule="auto"/>
-        <w:rPr>
-          <w:rFonts w:ascii="Times New Roman" w:eastAsia="Times New Roman" w:hAnsi="Times New Roman" w:cs="Times New Roman"/>
-          <w:bCs/>
-          <w:sz w:val="20"/>
-          <w:szCs w:val="24"/>
-        </w:rPr>
-      </w:pPr>
-      <w:r>
-        <w:rPr>
-          <w:rFonts w:ascii="Times New Roman" w:eastAsia="Times New Roman" w:hAnsi="Times New Roman" w:cs="Times New Roman"/>
-          <w:bCs/>
-          <w:sz w:val="20"/>
-          <w:szCs w:val="24"/>
-        </w:rPr>
-        <w:t>Quarterly_SSR_B_Timestrip.html</w:t>
-      </w:r>
-    </w:p>
-    <w:p>
-      <w:pPr>
-        <w:pStyle w:val="ListParagraph"/>
-        <w:numPr>
-          <w:ilvl w:val="3"/>
-          <w:numId w:val="3"/>
-        </w:numPr>
-        <w:spacing w:after="0" w:line="240" w:lineRule="auto"/>
-        <w:rPr>
-          <w:rFonts w:ascii="Times New Roman" w:eastAsia="Times New Roman" w:hAnsi="Times New Roman" w:cs="Times New Roman"/>
-          <w:bCs/>
-          <w:sz w:val="20"/>
-          <w:szCs w:val="24"/>
-        </w:rPr>
-      </w:pPr>
-      <w:r>
-        <w:rPr>
-          <w:rFonts w:ascii="Times New Roman" w:eastAsia="Times New Roman" w:hAnsi="Times New Roman" w:cs="Times New Roman"/>
-          <w:bCs/>
-          <w:sz w:val="20"/>
-          <w:szCs w:val="24"/>
-        </w:rPr>
-        <w:t>(If SSR-A was prime) Avg_SBE_Submod104.html</w:t>
+        <w:t>CSV files containing raw data (14x)</w:t>
       </w:r>
     </w:p>
     <w:p>
@@ -2410,32 +2573,70 @@
           <w:sz w:val="20"/>
           <w:szCs w:val="24"/>
         </w:rPr>
-        <w:t>CSV files containing raw data (14x)</w:t>
-      </w:r>
-    </w:p>
-    <w:p>
-      <w:pPr>
-        <w:pStyle w:val="ListParagraph"/>
-        <w:numPr>
-          <w:ilvl w:val="2"/>
-          <w:numId w:val="3"/>
-        </w:numPr>
-        <w:spacing w:after="0" w:line="240" w:lineRule="auto"/>
-        <w:rPr>
-          <w:rFonts w:ascii="Times New Roman" w:eastAsia="Times New Roman" w:hAnsi="Times New Roman" w:cs="Times New Roman"/>
-          <w:bCs/>
-          <w:sz w:val="20"/>
-          <w:szCs w:val="24"/>
-        </w:rPr>
-      </w:pPr>
-      <w:r>
-        <w:rPr>
-          <w:rFonts w:ascii="Times New Roman" w:eastAsia="Times New Roman" w:hAnsi="Times New Roman" w:cs="Times New Roman"/>
-          <w:bCs/>
-          <w:sz w:val="20"/>
-          <w:szCs w:val="24"/>
-        </w:rPr>
-        <w:t>Transmitter vs Baseplate Temp Plot (YYYYb_TX_BPT.html)</w:t>
+        <w:t>Transmitter vs Baseplate Temp Plot (</w:t>
+      </w:r>
+      <w:proofErr w:type="spellStart"/>
+      <w:r>
+        <w:rPr>
+          <w:rFonts w:ascii="Times New Roman" w:eastAsia="Times New Roman" w:hAnsi="Times New Roman" w:cs="Times New Roman"/>
+          <w:bCs/>
+          <w:sz w:val="20"/>
+          <w:szCs w:val="24"/>
+        </w:rPr>
+        <w:t>YYYYb_TX_BPT</w:t>
+      </w:r>
+      <w:proofErr w:type="spellEnd"/>
+      <w:r>
+        <w:rPr>
+          <w:rFonts w:ascii="Times New Roman" w:eastAsia="Times New Roman" w:hAnsi="Times New Roman" w:cs="Times New Roman"/>
+          <w:bCs/>
+          <w:sz w:val="20"/>
+          <w:szCs w:val="24"/>
+        </w:rPr>
+        <w:t>.</w:t>
+      </w:r>
+      <w:r>
+        <w:rPr>
+          <w:rFonts w:ascii="Times New Roman" w:eastAsia="Times New Roman" w:hAnsi="Times New Roman" w:cs="Times New Roman"/>
+          <w:bCs/>
+          <w:sz w:val="20"/>
+          <w:szCs w:val="24"/>
+        </w:rPr>
+        <w:t xml:space="preserve"> </w:t>
+      </w:r>
+      <w:r>
+        <w:rPr>
+          <w:rFonts w:ascii="Times New Roman" w:eastAsia="Times New Roman" w:hAnsi="Times New Roman" w:cs="Times New Roman"/>
+          <w:bCs/>
+          <w:sz w:val="20"/>
+          <w:szCs w:val="24"/>
+        </w:rPr>
+        <w:t>json)</w:t>
+      </w:r>
+    </w:p>
+    <w:p>
+      <w:pPr>
+        <w:pStyle w:val="ListParagraph"/>
+        <w:numPr>
+          <w:ilvl w:val="1"/>
+          <w:numId w:val="3"/>
+        </w:numPr>
+        <w:spacing w:after="0" w:line="240" w:lineRule="auto"/>
+        <w:rPr>
+          <w:rFonts w:ascii="Times New Roman" w:eastAsia="Times New Roman" w:hAnsi="Times New Roman" w:cs="Times New Roman"/>
+          <w:bCs/>
+          <w:sz w:val="20"/>
+          <w:szCs w:val="24"/>
+        </w:rPr>
+      </w:pPr>
+      <w:r>
+        <w:rPr>
+          <w:rFonts w:ascii="Times New Roman" w:eastAsia="Times New Roman" w:hAnsi="Times New Roman" w:cs="Times New Roman"/>
+          <w:bCs/>
+          <w:sz w:val="20"/>
+          <w:szCs w:val="24"/>
+        </w:rPr>
+        <w:t>PNG files will be populated in a new directory “output” in the same location where the files were selected from.</w:t>
       </w:r>
     </w:p>
     <w:p>
@@ -2774,52 +2975,7 @@
           <w:sz w:val="20"/>
           <w:szCs w:val="24"/>
         </w:rPr>
-        <w:t xml:space="preserve">cp </w:t>
-      </w:r>
-      <w:r>
-        <w:rPr>
-          <w:rFonts w:ascii="Times New Roman" w:eastAsia="Times New Roman" w:hAnsi="Times New Roman" w:cs="Times New Roman"/>
-          <w:bCs/>
-          <w:sz w:val="20"/>
-          <w:szCs w:val="24"/>
-        </w:rPr>
-        <w:t>CONTANT-DBE-VALUES.txt</w:t>
-      </w:r>
-      <w:r>
-        <w:rPr>
-          <w:rFonts w:ascii="Times New Roman" w:eastAsia="Times New Roman" w:hAnsi="Times New Roman" w:cs="Times New Roman"/>
-          <w:bCs/>
-          <w:sz w:val="20"/>
-          <w:szCs w:val="24"/>
-        </w:rPr>
-        <w:t xml:space="preserve"> </w:t>
-      </w:r>
-      <w:r>
-        <w:rPr>
-          <w:rFonts w:ascii="Times New Roman" w:eastAsia="Times New Roman" w:hAnsi="Times New Roman" w:cs="Times New Roman"/>
-          <w:bCs/>
-          <w:sz w:val="20"/>
-          <w:szCs w:val="24"/>
-        </w:rPr>
-        <w:t>CONTANT-DBE-VALUES</w:t>
-      </w:r>
-      <w:r>
-        <w:rPr>
-          <w:rFonts w:ascii="Times New Roman" w:eastAsia="Times New Roman" w:hAnsi="Times New Roman" w:cs="Times New Roman"/>
-          <w:bCs/>
-          <w:sz w:val="20"/>
-          <w:szCs w:val="24"/>
-        </w:rPr>
-        <w:t>-yyyyddd</w:t>
-      </w:r>
-      <w:r>
-        <w:rPr>
-          <w:rFonts w:ascii="Times New Roman" w:eastAsia="Times New Roman" w:hAnsi="Times New Roman" w:cs="Times New Roman"/>
-          <w:bCs/>
-          <w:sz w:val="20"/>
-          <w:szCs w:val="24"/>
-        </w:rPr>
-        <w:t>.txt</w:t>
+        <w:t>cp CONTANT-DBE-VALUES.txt CONTANT-DBE-VALUES-yyyyddd.txt</w:t>
       </w:r>
     </w:p>
     <w:p>
@@ -2869,6 +3025,7 @@
           <w:sz w:val="20"/>
           <w:szCs w:val="24"/>
         </w:rPr>
+        <w:lastRenderedPageBreak/>
         <w:t xml:space="preserve">Searching for when BEAT reports passed through </w:t>
       </w:r>
       <w:proofErr w:type="spellStart"/>
@@ -2956,10 +3113,10 @@
         <w:rPr>
           <w:rFonts w:ascii="Times New Roman" w:eastAsia="Times New Roman" w:hAnsi="Times New Roman" w:cs="Times New Roman"/>
           <w:bCs/>
-          <w:sz w:val="20"/>
-          <w:szCs w:val="24"/>
-        </w:rPr>
-        <w:lastRenderedPageBreak/>
+          <w:noProof/>
+          <w:sz w:val="20"/>
+          <w:szCs w:val="24"/>
+        </w:rPr>
         <w:drawing>
           <wp:inline distT="0" distB="0" distL="0" distR="0" wp14:anchorId="3AF33FD0" wp14:editId="070FE075">
             <wp:extent cx="3934448" cy="2333767"/>
@@ -3066,25 +3223,7 @@
           <w:sz w:val="20"/>
           <w:szCs w:val="24"/>
         </w:rPr>
-        <w:t xml:space="preserve"> </w:t>
-      </w:r>
-      <w:r>
-        <w:rPr>
-          <w:rFonts w:ascii="Times New Roman" w:eastAsia="Times New Roman" w:hAnsi="Times New Roman" w:cs="Times New Roman"/>
-          <w:bCs/>
-          <w:sz w:val="20"/>
-          <w:szCs w:val="24"/>
-        </w:rPr>
-        <w:t>CONSTANT-DBE-VALUES.txt</w:t>
-      </w:r>
-      <w:r>
-        <w:rPr>
-          <w:rFonts w:ascii="Times New Roman" w:eastAsia="Times New Roman" w:hAnsi="Times New Roman" w:cs="Times New Roman"/>
-          <w:bCs/>
-          <w:sz w:val="20"/>
-          <w:szCs w:val="24"/>
-        </w:rPr>
-        <w:t xml:space="preserve"> &amp;</w:t>
+        <w:t xml:space="preserve"> CONSTANT-DBE-VALUES.txt &amp;</w:t>
       </w:r>
     </w:p>
     <w:p>
@@ -3176,6 +3315,7 @@
         <w:rPr>
           <w:rFonts w:ascii="Times New Roman" w:eastAsia="Times New Roman" w:hAnsi="Times New Roman" w:cs="Times New Roman"/>
           <w:bCs/>
+          <w:noProof/>
           <w:sz w:val="20"/>
           <w:szCs w:val="24"/>
         </w:rPr>
@@ -3707,16 +3847,7 @@
           <w:sz w:val="20"/>
           <w:szCs w:val="24"/>
         </w:rPr>
-        <w:t>CONSTANT-DBE-VALUES</w:t>
-      </w:r>
-      <w:r>
-        <w:rPr>
-          <w:rFonts w:ascii="Times New Roman" w:eastAsia="Times New Roman" w:hAnsi="Times New Roman" w:cs="Times New Roman"/>
-          <w:bCs/>
-          <w:sz w:val="20"/>
-          <w:szCs w:val="24"/>
-        </w:rPr>
-        <w:t>-yyyyddd.txt&gt;</w:t>
+        <w:t>CONSTANT-DBE-VALUES-yyyyddd.txt&gt;</w:t>
       </w:r>
     </w:p>
     <w:p>

</xml_diff>